<commit_message>
Add TA office hours (Wed 2:30-4:30 pm, HOH 332) to syllabus
Co-Authored-By: Claude Fable 5 <noreply@anthropic.com>
</commit_message>
<xml_diff>
--- a/syllabus/mkt566-syllabus-proserpio.docx
+++ b/syllabus/mkt566-syllabus-proserpio.docx
@@ -270,7 +270,7 @@
         <w:t>Office:</w:t>
       </w:r>
       <w:r>
-        <w:t xml:space="preserve"> </w:t>
+        <w:t xml:space="preserve"> HOH 332</w:t>
       </w:r>
     </w:p>
     <w:p>
@@ -286,6 +286,9 @@
           <w:bCs/>
         </w:rPr>
         <w:t xml:space="preserve">Office Hours: </w:t>
+      </w:r>
+      <w:r>
+        <w:t>Wednesdays, 2:30 – 4:30 pm</w:t>
       </w:r>
     </w:p>
     <w:p>

</xml_diff>

<commit_message>
Update syllabus (docx + PDF) saved from Word with final TA office hours
Co-Authored-By: Claude Fable 5 <noreply@anthropic.com>
</commit_message>
<xml_diff>
--- a/syllabus/mkt566-syllabus-proserpio.docx
+++ b/syllabus/mkt566-syllabus-proserpio.docx
@@ -1,6 +1,6 @@
 
 <file path=word/document.xml><?xml version="1.0" encoding="utf-8"?>
-<w:document xmlns:wpc="http://schemas.microsoft.com/office/word/2010/wordprocessingCanvas" xmlns:cx="http://schemas.microsoft.com/office/drawing/2014/chartex" xmlns:cx1="http://schemas.microsoft.com/office/drawing/2015/9/8/chartex" xmlns:cx2="http://schemas.microsoft.com/office/drawing/2015/10/21/chartex" xmlns:cx3="http://schemas.microsoft.com/office/drawing/2016/5/9/chartex" xmlns:cx4="http://schemas.microsoft.com/office/drawing/2016/5/10/chartex" xmlns:cx5="http://schemas.microsoft.com/office/drawing/2016/5/11/chartex" xmlns:cx6="http://schemas.microsoft.com/office/drawing/2016/5/12/chartex" xmlns:cx7="http://schemas.microsoft.com/office/drawing/2016/5/13/chartex" xmlns:cx8="http://schemas.microsoft.com/office/drawing/2016/5/14/chartex" xmlns:mc="http://schemas.openxmlformats.org/markup-compatibility/2006" xmlns:m="http://schemas.openxmlformats.org/officeDocument/2006/math" xmlns:aink="http://schemas.microsoft.com/office/drawing/2016/ink" xmlns:am3d="http://schemas.microsoft.com/office/drawing/2017/model3d" xmlns:oel="http://schemas.microsoft.com/office/2019/extlst" xmlns:r="http://schemas.openxmlformats.org/officeDocument/2006/relationships" xmlns:wp14="http://schemas.microsoft.com/office/word/2010/wordprocessingDrawing" xmlns:wp="http://schemas.openxmlformats.org/drawingml/2006/wordprocessingDrawing" xmlns:wpg="http://schemas.microsoft.com/office/word/2010/wordprocessingGroup" xmlns:wpi="http://schemas.microsoft.com/office/word/2010/wordprocessingInk" xmlns:wps="http://schemas.microsoft.com/office/word/2010/wordprocessingShape" xmlns:o="urn:schemas-microsoft-com:office:office" xmlns:v="urn:schemas-microsoft-com:vml" xmlns:w10="urn:schemas-microsoft-com:office:word" xmlns:w="http://schemas.openxmlformats.org/wordprocessingml/2006/main" xmlns:w14="http://schemas.microsoft.com/office/word/2010/wordml" xmlns:w15="http://schemas.microsoft.com/office/word/2012/wordml" xmlns:w16cex="http://schemas.microsoft.com/office/word/2018/wordml/cex" xmlns:w16cid="http://schemas.microsoft.com/office/word/2016/wordml/cid" xmlns:w16="http://schemas.microsoft.com/office/word/2018/wordml" xmlns:w16sdtdh="http://schemas.microsoft.com/office/word/2020/wordml/sdtdatahash" xmlns:w16sdtfl="http://schemas.microsoft.com/office/word/2024/wordml/sdtformatlock" xmlns:w16se="http://schemas.microsoft.com/office/word/2015/wordml/symex" xmlns:w16du="http://schemas.microsoft.com/office/word/2023/wordml/word16du" xmlns:wne="http://schemas.microsoft.com/office/word/2006/wordml" mc:Ignorable="w14 w15 w16se w16cid w16 w16cex w16sdtdh w16sdtfl w16du wp14">
+<w:document xmlns:wpc="http://schemas.microsoft.com/office/word/2010/wordprocessingCanvas" xmlns:cx="http://schemas.microsoft.com/office/drawing/2014/chartex" xmlns:cx1="http://schemas.microsoft.com/office/drawing/2015/9/8/chartex" xmlns:cx2="http://schemas.microsoft.com/office/drawing/2015/10/21/chartex" xmlns:cx3="http://schemas.microsoft.com/office/drawing/2016/5/9/chartex" xmlns:cx4="http://schemas.microsoft.com/office/drawing/2016/5/10/chartex" xmlns:cx5="http://schemas.microsoft.com/office/drawing/2016/5/11/chartex" xmlns:cx6="http://schemas.microsoft.com/office/drawing/2016/5/12/chartex" xmlns:cx7="http://schemas.microsoft.com/office/drawing/2016/5/13/chartex" xmlns:cx8="http://schemas.microsoft.com/office/drawing/2016/5/14/chartex" xmlns:mc="http://schemas.openxmlformats.org/markup-compatibility/2006" xmlns:m="http://schemas.openxmlformats.org/officeDocument/2006/math" xmlns:aink="http://schemas.microsoft.com/office/drawing/2016/ink" xmlns:am3d="http://schemas.microsoft.com/office/drawing/2017/model3d" xmlns:oel="http://schemas.microsoft.com/office/2019/extlst" xmlns:r="http://schemas.openxmlformats.org/officeDocument/2006/relationships" xmlns:wp14="http://schemas.microsoft.com/office/word/2010/wordprocessingDrawing" xmlns:wp="http://schemas.openxmlformats.org/drawingml/2006/wordprocessingDrawing" xmlns:wpg="http://schemas.microsoft.com/office/word/2010/wordprocessingGroup" xmlns:wpi="http://schemas.microsoft.com/office/word/2010/wordprocessingInk" xmlns:wps="http://schemas.microsoft.com/office/word/2010/wordprocessingShape" xmlns:o="urn:schemas-microsoft-com:office:office" xmlns:v="urn:schemas-microsoft-com:vml" xmlns:w10="urn:schemas-microsoft-com:office:word" xmlns:w="http://schemas.openxmlformats.org/wordprocessingml/2006/main" xmlns:w14="http://schemas.microsoft.com/office/word/2010/wordml" xmlns:w15="http://schemas.microsoft.com/office/word/2012/wordml" xmlns:w16cei="http://schemas.microsoft.com/office/word/2026/wordml/cei" xmlns:w16cex="http://schemas.microsoft.com/office/word/2018/wordml/cex" xmlns:w16cid="http://schemas.microsoft.com/office/word/2016/wordml/cid" xmlns:w16="http://schemas.microsoft.com/office/word/2018/wordml" xmlns:w16sdtdh="http://schemas.microsoft.com/office/word/2020/wordml/sdtdatahash" xmlns:w16sdtfl="http://schemas.microsoft.com/office/word/2024/wordml/sdtformatlock" xmlns:w16se="http://schemas.microsoft.com/office/word/2015/wordml/symex" xmlns:w16du="http://schemas.microsoft.com/office/word/2023/wordml/word16du" xmlns:wne="http://schemas.microsoft.com/office/word/2006/wordml" mc:Ignorable="w14 w15 w16se w16cid w16 w16cex w16sdtdh w16sdtfl w16du wp14">
   <w:body>
     <w:p>
       <w:pPr>
@@ -289,6 +289,9 @@
       </w:r>
       <w:r>
         <w:t>Wednesdays, 2:30 – 4:30 pm</w:t>
+      </w:r>
+      <w:r>
+        <w:t>, or by appointment.</w:t>
       </w:r>
     </w:p>
     <w:p>
@@ -17118,7 +17121,7 @@
 </file>
 
 <file path=word/endnotes.xml><?xml version="1.0" encoding="utf-8"?>
-<w:endnotes xmlns:wpc="http://schemas.microsoft.com/office/word/2010/wordprocessingCanvas" xmlns:cx="http://schemas.microsoft.com/office/drawing/2014/chartex" xmlns:cx1="http://schemas.microsoft.com/office/drawing/2015/9/8/chartex" xmlns:cx2="http://schemas.microsoft.com/office/drawing/2015/10/21/chartex" xmlns:cx3="http://schemas.microsoft.com/office/drawing/2016/5/9/chartex" xmlns:cx4="http://schemas.microsoft.com/office/drawing/2016/5/10/chartex" xmlns:cx5="http://schemas.microsoft.com/office/drawing/2016/5/11/chartex" xmlns:cx6="http://schemas.microsoft.com/office/drawing/2016/5/12/chartex" xmlns:cx7="http://schemas.microsoft.com/office/drawing/2016/5/13/chartex" xmlns:cx8="http://schemas.microsoft.com/office/drawing/2016/5/14/chartex" xmlns:mc="http://schemas.openxmlformats.org/markup-compatibility/2006" xmlns:m="http://schemas.openxmlformats.org/officeDocument/2006/math" xmlns:aink="http://schemas.microsoft.com/office/drawing/2016/ink" xmlns:am3d="http://schemas.microsoft.com/office/drawing/2017/model3d" xmlns:oel="http://schemas.microsoft.com/office/2019/extlst" xmlns:r="http://schemas.openxmlformats.org/officeDocument/2006/relationships" xmlns:wp14="http://schemas.microsoft.com/office/word/2010/wordprocessingDrawing" xmlns:wp="http://schemas.openxmlformats.org/drawingml/2006/wordprocessingDrawing" xmlns:wpg="http://schemas.microsoft.com/office/word/2010/wordprocessingGroup" xmlns:wpi="http://schemas.microsoft.com/office/word/2010/wordprocessingInk" xmlns:wps="http://schemas.microsoft.com/office/word/2010/wordprocessingShape" xmlns:o="urn:schemas-microsoft-com:office:office" xmlns:v="urn:schemas-microsoft-com:vml" xmlns:w10="urn:schemas-microsoft-com:office:word" xmlns:w="http://schemas.openxmlformats.org/wordprocessingml/2006/main" xmlns:w14="http://schemas.microsoft.com/office/word/2010/wordml" xmlns:w15="http://schemas.microsoft.com/office/word/2012/wordml" xmlns:w16cex="http://schemas.microsoft.com/office/word/2018/wordml/cex" xmlns:w16cid="http://schemas.microsoft.com/office/word/2016/wordml/cid" xmlns:w16="http://schemas.microsoft.com/office/word/2018/wordml" xmlns:w16sdtdh="http://schemas.microsoft.com/office/word/2020/wordml/sdtdatahash" xmlns:w16sdtfl="http://schemas.microsoft.com/office/word/2024/wordml/sdtformatlock" xmlns:w16se="http://schemas.microsoft.com/office/word/2015/wordml/symex" xmlns:w16du="http://schemas.microsoft.com/office/word/2023/wordml/word16du" xmlns:wne="http://schemas.microsoft.com/office/word/2006/wordml" mc:Ignorable="w14 w15 w16se w16cid w16 w16cex w16sdtdh w16sdtfl w16du wp14">
+<w:endnotes xmlns:wpc="http://schemas.microsoft.com/office/word/2010/wordprocessingCanvas" xmlns:cx="http://schemas.microsoft.com/office/drawing/2014/chartex" xmlns:cx1="http://schemas.microsoft.com/office/drawing/2015/9/8/chartex" xmlns:cx2="http://schemas.microsoft.com/office/drawing/2015/10/21/chartex" xmlns:cx3="http://schemas.microsoft.com/office/drawing/2016/5/9/chartex" xmlns:cx4="http://schemas.microsoft.com/office/drawing/2016/5/10/chartex" xmlns:cx5="http://schemas.microsoft.com/office/drawing/2016/5/11/chartex" xmlns:cx6="http://schemas.microsoft.com/office/drawing/2016/5/12/chartex" xmlns:cx7="http://schemas.microsoft.com/office/drawing/2016/5/13/chartex" xmlns:cx8="http://schemas.microsoft.com/office/drawing/2016/5/14/chartex" xmlns:mc="http://schemas.openxmlformats.org/markup-compatibility/2006" xmlns:m="http://schemas.openxmlformats.org/officeDocument/2006/math" xmlns:aink="http://schemas.microsoft.com/office/drawing/2016/ink" xmlns:am3d="http://schemas.microsoft.com/office/drawing/2017/model3d" xmlns:oel="http://schemas.microsoft.com/office/2019/extlst" xmlns:r="http://schemas.openxmlformats.org/officeDocument/2006/relationships" xmlns:wp14="http://schemas.microsoft.com/office/word/2010/wordprocessingDrawing" xmlns:wp="http://schemas.openxmlformats.org/drawingml/2006/wordprocessingDrawing" xmlns:wpg="http://schemas.microsoft.com/office/word/2010/wordprocessingGroup" xmlns:wpi="http://schemas.microsoft.com/office/word/2010/wordprocessingInk" xmlns:wps="http://schemas.microsoft.com/office/word/2010/wordprocessingShape" xmlns:o="urn:schemas-microsoft-com:office:office" xmlns:v="urn:schemas-microsoft-com:vml" xmlns:w10="urn:schemas-microsoft-com:office:word" xmlns:w="http://schemas.openxmlformats.org/wordprocessingml/2006/main" xmlns:w14="http://schemas.microsoft.com/office/word/2010/wordml" xmlns:w15="http://schemas.microsoft.com/office/word/2012/wordml" xmlns:w16cei="http://schemas.microsoft.com/office/word/2026/wordml/cei" xmlns:w16cex="http://schemas.microsoft.com/office/word/2018/wordml/cex" xmlns:w16cid="http://schemas.microsoft.com/office/word/2016/wordml/cid" xmlns:w16="http://schemas.microsoft.com/office/word/2018/wordml" xmlns:w16sdtdh="http://schemas.microsoft.com/office/word/2020/wordml/sdtdatahash" xmlns:w16sdtfl="http://schemas.microsoft.com/office/word/2024/wordml/sdtformatlock" xmlns:w16se="http://schemas.microsoft.com/office/word/2015/wordml/symex" xmlns:w16du="http://schemas.microsoft.com/office/word/2023/wordml/word16du" xmlns:wne="http://schemas.microsoft.com/office/word/2006/wordml" mc:Ignorable="w14 w15 w16se w16cid w16 w16cex w16sdtdh w16sdtfl w16du wp14">
   <w:endnote w:type="separator" w:id="-1">
     <w:p>
       <w:r>
@@ -17137,7 +17140,7 @@
 </file>
 
 <file path=word/footer1.xml><?xml version="1.0" encoding="utf-8"?>
-<w:ftr xmlns:wpc="http://schemas.microsoft.com/office/word/2010/wordprocessingCanvas" xmlns:cx="http://schemas.microsoft.com/office/drawing/2014/chartex" xmlns:cx1="http://schemas.microsoft.com/office/drawing/2015/9/8/chartex" xmlns:cx2="http://schemas.microsoft.com/office/drawing/2015/10/21/chartex" xmlns:cx3="http://schemas.microsoft.com/office/drawing/2016/5/9/chartex" xmlns:cx4="http://schemas.microsoft.com/office/drawing/2016/5/10/chartex" xmlns:cx5="http://schemas.microsoft.com/office/drawing/2016/5/11/chartex" xmlns:cx6="http://schemas.microsoft.com/office/drawing/2016/5/12/chartex" xmlns:cx7="http://schemas.microsoft.com/office/drawing/2016/5/13/chartex" xmlns:cx8="http://schemas.microsoft.com/office/drawing/2016/5/14/chartex" xmlns:mc="http://schemas.openxmlformats.org/markup-compatibility/2006" xmlns:m="http://schemas.openxmlformats.org/officeDocument/2006/math" xmlns:aink="http://schemas.microsoft.com/office/drawing/2016/ink" xmlns:am3d="http://schemas.microsoft.com/office/drawing/2017/model3d" xmlns:oel="http://schemas.microsoft.com/office/2019/extlst" xmlns:r="http://schemas.openxmlformats.org/officeDocument/2006/relationships" xmlns:wp14="http://schemas.microsoft.com/office/word/2010/wordprocessingDrawing" xmlns:wp="http://schemas.openxmlformats.org/drawingml/2006/wordprocessingDrawing" xmlns:wpg="http://schemas.microsoft.com/office/word/2010/wordprocessingGroup" xmlns:wpi="http://schemas.microsoft.com/office/word/2010/wordprocessingInk" xmlns:wps="http://schemas.microsoft.com/office/word/2010/wordprocessingShape" xmlns:o="urn:schemas-microsoft-com:office:office" xmlns:v="urn:schemas-microsoft-com:vml" xmlns:w10="urn:schemas-microsoft-com:office:word" xmlns:w="http://schemas.openxmlformats.org/wordprocessingml/2006/main" xmlns:w14="http://schemas.microsoft.com/office/word/2010/wordml" xmlns:w15="http://schemas.microsoft.com/office/word/2012/wordml" xmlns:w16cex="http://schemas.microsoft.com/office/word/2018/wordml/cex" xmlns:w16cid="http://schemas.microsoft.com/office/word/2016/wordml/cid" xmlns:w16="http://schemas.microsoft.com/office/word/2018/wordml" xmlns:w16sdtdh="http://schemas.microsoft.com/office/word/2020/wordml/sdtdatahash" xmlns:w16sdtfl="http://schemas.microsoft.com/office/word/2024/wordml/sdtformatlock" xmlns:w16se="http://schemas.microsoft.com/office/word/2015/wordml/symex" xmlns:w16du="http://schemas.microsoft.com/office/word/2023/wordml/word16du" xmlns:wne="http://schemas.microsoft.com/office/word/2006/wordml" mc:Ignorable="w14 w15 w16se w16cid w16 w16cex w16sdtdh w16sdtfl w16du wp14">
+<w:ftr xmlns:wpc="http://schemas.microsoft.com/office/word/2010/wordprocessingCanvas" xmlns:cx="http://schemas.microsoft.com/office/drawing/2014/chartex" xmlns:cx1="http://schemas.microsoft.com/office/drawing/2015/9/8/chartex" xmlns:cx2="http://schemas.microsoft.com/office/drawing/2015/10/21/chartex" xmlns:cx3="http://schemas.microsoft.com/office/drawing/2016/5/9/chartex" xmlns:cx4="http://schemas.microsoft.com/office/drawing/2016/5/10/chartex" xmlns:cx5="http://schemas.microsoft.com/office/drawing/2016/5/11/chartex" xmlns:cx6="http://schemas.microsoft.com/office/drawing/2016/5/12/chartex" xmlns:cx7="http://schemas.microsoft.com/office/drawing/2016/5/13/chartex" xmlns:cx8="http://schemas.microsoft.com/office/drawing/2016/5/14/chartex" xmlns:mc="http://schemas.openxmlformats.org/markup-compatibility/2006" xmlns:m="http://schemas.openxmlformats.org/officeDocument/2006/math" xmlns:aink="http://schemas.microsoft.com/office/drawing/2016/ink" xmlns:am3d="http://schemas.microsoft.com/office/drawing/2017/model3d" xmlns:oel="http://schemas.microsoft.com/office/2019/extlst" xmlns:r="http://schemas.openxmlformats.org/officeDocument/2006/relationships" xmlns:wp14="http://schemas.microsoft.com/office/word/2010/wordprocessingDrawing" xmlns:wp="http://schemas.openxmlformats.org/drawingml/2006/wordprocessingDrawing" xmlns:wpg="http://schemas.microsoft.com/office/word/2010/wordprocessingGroup" xmlns:wpi="http://schemas.microsoft.com/office/word/2010/wordprocessingInk" xmlns:wps="http://schemas.microsoft.com/office/word/2010/wordprocessingShape" xmlns:o="urn:schemas-microsoft-com:office:office" xmlns:v="urn:schemas-microsoft-com:vml" xmlns:w10="urn:schemas-microsoft-com:office:word" xmlns:w="http://schemas.openxmlformats.org/wordprocessingml/2006/main" xmlns:w14="http://schemas.microsoft.com/office/word/2010/wordml" xmlns:w15="http://schemas.microsoft.com/office/word/2012/wordml" xmlns:w16cei="http://schemas.microsoft.com/office/word/2026/wordml/cei" xmlns:w16cex="http://schemas.microsoft.com/office/word/2018/wordml/cex" xmlns:w16cid="http://schemas.microsoft.com/office/word/2016/wordml/cid" xmlns:w16="http://schemas.microsoft.com/office/word/2018/wordml" xmlns:w16sdtdh="http://schemas.microsoft.com/office/word/2020/wordml/sdtdatahash" xmlns:w16sdtfl="http://schemas.microsoft.com/office/word/2024/wordml/sdtformatlock" xmlns:w16se="http://schemas.microsoft.com/office/word/2015/wordml/symex" xmlns:w16du="http://schemas.microsoft.com/office/word/2023/wordml/word16du" xmlns:wne="http://schemas.microsoft.com/office/word/2006/wordml" mc:Ignorable="w14 w15 w16se w16cid w16 w16cex w16sdtdh w16sdtfl w16du wp14">
   <w:sdt>
     <w:sdtPr>
       <w:id w:val="1937251980"/>
@@ -17209,7 +17212,7 @@
 </file>
 
 <file path=word/footnotes.xml><?xml version="1.0" encoding="utf-8"?>
-<w:footnotes xmlns:wpc="http://schemas.microsoft.com/office/word/2010/wordprocessingCanvas" xmlns:cx="http://schemas.microsoft.com/office/drawing/2014/chartex" xmlns:cx1="http://schemas.microsoft.com/office/drawing/2015/9/8/chartex" xmlns:cx2="http://schemas.microsoft.com/office/drawing/2015/10/21/chartex" xmlns:cx3="http://schemas.microsoft.com/office/drawing/2016/5/9/chartex" xmlns:cx4="http://schemas.microsoft.com/office/drawing/2016/5/10/chartex" xmlns:cx5="http://schemas.microsoft.com/office/drawing/2016/5/11/chartex" xmlns:cx6="http://schemas.microsoft.com/office/drawing/2016/5/12/chartex" xmlns:cx7="http://schemas.microsoft.com/office/drawing/2016/5/13/chartex" xmlns:cx8="http://schemas.microsoft.com/office/drawing/2016/5/14/chartex" xmlns:mc="http://schemas.openxmlformats.org/markup-compatibility/2006" xmlns:m="http://schemas.openxmlformats.org/officeDocument/2006/math" xmlns:aink="http://schemas.microsoft.com/office/drawing/2016/ink" xmlns:am3d="http://schemas.microsoft.com/office/drawing/2017/model3d" xmlns:oel="http://schemas.microsoft.com/office/2019/extlst" xmlns:r="http://schemas.openxmlformats.org/officeDocument/2006/relationships" xmlns:wp14="http://schemas.microsoft.com/office/word/2010/wordprocessingDrawing" xmlns:wp="http://schemas.openxmlformats.org/drawingml/2006/wordprocessingDrawing" xmlns:wpg="http://schemas.microsoft.com/office/word/2010/wordprocessingGroup" xmlns:wpi="http://schemas.microsoft.com/office/word/2010/wordprocessingInk" xmlns:wps="http://schemas.microsoft.com/office/word/2010/wordprocessingShape" xmlns:o="urn:schemas-microsoft-com:office:office" xmlns:v="urn:schemas-microsoft-com:vml" xmlns:w10="urn:schemas-microsoft-com:office:word" xmlns:w="http://schemas.openxmlformats.org/wordprocessingml/2006/main" xmlns:w14="http://schemas.microsoft.com/office/word/2010/wordml" xmlns:w15="http://schemas.microsoft.com/office/word/2012/wordml" xmlns:w16cex="http://schemas.microsoft.com/office/word/2018/wordml/cex" xmlns:w16cid="http://schemas.microsoft.com/office/word/2016/wordml/cid" xmlns:w16="http://schemas.microsoft.com/office/word/2018/wordml" xmlns:w16sdtdh="http://schemas.microsoft.com/office/word/2020/wordml/sdtdatahash" xmlns:w16sdtfl="http://schemas.microsoft.com/office/word/2024/wordml/sdtformatlock" xmlns:w16se="http://schemas.microsoft.com/office/word/2015/wordml/symex" xmlns:w16du="http://schemas.microsoft.com/office/word/2023/wordml/word16du" xmlns:wne="http://schemas.microsoft.com/office/word/2006/wordml" mc:Ignorable="w14 w15 w16se w16cid w16 w16cex w16sdtdh w16sdtfl w16du wp14">
+<w:footnotes xmlns:wpc="http://schemas.microsoft.com/office/word/2010/wordprocessingCanvas" xmlns:cx="http://schemas.microsoft.com/office/drawing/2014/chartex" xmlns:cx1="http://schemas.microsoft.com/office/drawing/2015/9/8/chartex" xmlns:cx2="http://schemas.microsoft.com/office/drawing/2015/10/21/chartex" xmlns:cx3="http://schemas.microsoft.com/office/drawing/2016/5/9/chartex" xmlns:cx4="http://schemas.microsoft.com/office/drawing/2016/5/10/chartex" xmlns:cx5="http://schemas.microsoft.com/office/drawing/2016/5/11/chartex" xmlns:cx6="http://schemas.microsoft.com/office/drawing/2016/5/12/chartex" xmlns:cx7="http://schemas.microsoft.com/office/drawing/2016/5/13/chartex" xmlns:cx8="http://schemas.microsoft.com/office/drawing/2016/5/14/chartex" xmlns:mc="http://schemas.openxmlformats.org/markup-compatibility/2006" xmlns:m="http://schemas.openxmlformats.org/officeDocument/2006/math" xmlns:aink="http://schemas.microsoft.com/office/drawing/2016/ink" xmlns:am3d="http://schemas.microsoft.com/office/drawing/2017/model3d" xmlns:oel="http://schemas.microsoft.com/office/2019/extlst" xmlns:r="http://schemas.openxmlformats.org/officeDocument/2006/relationships" xmlns:wp14="http://schemas.microsoft.com/office/word/2010/wordprocessingDrawing" xmlns:wp="http://schemas.openxmlformats.org/drawingml/2006/wordprocessingDrawing" xmlns:wpg="http://schemas.microsoft.com/office/word/2010/wordprocessingGroup" xmlns:wpi="http://schemas.microsoft.com/office/word/2010/wordprocessingInk" xmlns:wps="http://schemas.microsoft.com/office/word/2010/wordprocessingShape" xmlns:o="urn:schemas-microsoft-com:office:office" xmlns:v="urn:schemas-microsoft-com:vml" xmlns:w10="urn:schemas-microsoft-com:office:word" xmlns:w="http://schemas.openxmlformats.org/wordprocessingml/2006/main" xmlns:w14="http://schemas.microsoft.com/office/word/2010/wordml" xmlns:w15="http://schemas.microsoft.com/office/word/2012/wordml" xmlns:w16cei="http://schemas.microsoft.com/office/word/2026/wordml/cei" xmlns:w16cex="http://schemas.microsoft.com/office/word/2018/wordml/cex" xmlns:w16cid="http://schemas.microsoft.com/office/word/2016/wordml/cid" xmlns:w16="http://schemas.microsoft.com/office/word/2018/wordml" xmlns:w16sdtdh="http://schemas.microsoft.com/office/word/2020/wordml/sdtdatahash" xmlns:w16sdtfl="http://schemas.microsoft.com/office/word/2024/wordml/sdtformatlock" xmlns:w16se="http://schemas.microsoft.com/office/word/2015/wordml/symex" xmlns:w16du="http://schemas.microsoft.com/office/word/2023/wordml/word16du" xmlns:wne="http://schemas.microsoft.com/office/word/2006/wordml" mc:Ignorable="w14 w15 w16se w16cid w16 w16cex w16sdtdh w16sdtfl w16du wp14">
   <w:footnote w:type="separator" w:id="-1">
     <w:p>
       <w:r>
@@ -17228,7 +17231,7 @@
 </file>
 
 <file path=word/numbering.xml><?xml version="1.0" encoding="utf-8"?>
-<w:numbering xmlns:wpc="http://schemas.microsoft.com/office/word/2010/wordprocessingCanvas" xmlns:cx="http://schemas.microsoft.com/office/drawing/2014/chartex" xmlns:cx1="http://schemas.microsoft.com/office/drawing/2015/9/8/chartex" xmlns:cx2="http://schemas.microsoft.com/office/drawing/2015/10/21/chartex" xmlns:cx3="http://schemas.microsoft.com/office/drawing/2016/5/9/chartex" xmlns:cx4="http://schemas.microsoft.com/office/drawing/2016/5/10/chartex" xmlns:cx5="http://schemas.microsoft.com/office/drawing/2016/5/11/chartex" xmlns:cx6="http://schemas.microsoft.com/office/drawing/2016/5/12/chartex" xmlns:cx7="http://schemas.microsoft.com/office/drawing/2016/5/13/chartex" xmlns:cx8="http://schemas.microsoft.com/office/drawing/2016/5/14/chartex" xmlns:mc="http://schemas.openxmlformats.org/markup-compatibility/2006" xmlns:m="http://schemas.openxmlformats.org/officeDocument/2006/math" xmlns:aink="http://schemas.microsoft.com/office/drawing/2016/ink" xmlns:am3d="http://schemas.microsoft.com/office/drawing/2017/model3d" xmlns:oel="http://schemas.microsoft.com/office/2019/extlst" xmlns:r="http://schemas.openxmlformats.org/officeDocument/2006/relationships" xmlns:wp14="http://schemas.microsoft.com/office/word/2010/wordprocessingDrawing" xmlns:wp="http://schemas.openxmlformats.org/drawingml/2006/wordprocessingDrawing" xmlns:wpg="http://schemas.microsoft.com/office/word/2010/wordprocessingGroup" xmlns:wpi="http://schemas.microsoft.com/office/word/2010/wordprocessingInk" xmlns:wps="http://schemas.microsoft.com/office/word/2010/wordprocessingShape" xmlns:o="urn:schemas-microsoft-com:office:office" xmlns:v="urn:schemas-microsoft-com:vml" xmlns:w10="urn:schemas-microsoft-com:office:word" xmlns:w="http://schemas.openxmlformats.org/wordprocessingml/2006/main" xmlns:w14="http://schemas.microsoft.com/office/word/2010/wordml" xmlns:w15="http://schemas.microsoft.com/office/word/2012/wordml" xmlns:w16cex="http://schemas.microsoft.com/office/word/2018/wordml/cex" xmlns:w16cid="http://schemas.microsoft.com/office/word/2016/wordml/cid" xmlns:w16="http://schemas.microsoft.com/office/word/2018/wordml" xmlns:w16sdtdh="http://schemas.microsoft.com/office/word/2020/wordml/sdtdatahash" xmlns:w16sdtfl="http://schemas.microsoft.com/office/word/2024/wordml/sdtformatlock" xmlns:w16se="http://schemas.microsoft.com/office/word/2015/wordml/symex" xmlns:w16du="http://schemas.microsoft.com/office/word/2023/wordml/word16du" xmlns:wne="http://schemas.microsoft.com/office/word/2006/wordml" mc:Ignorable="w14 w15 w16se w16cid w16 w16cex w16sdtdh w16sdtfl w16du wp14">
+<w:numbering xmlns:wpc="http://schemas.microsoft.com/office/word/2010/wordprocessingCanvas" xmlns:cx="http://schemas.microsoft.com/office/drawing/2014/chartex" xmlns:cx1="http://schemas.microsoft.com/office/drawing/2015/9/8/chartex" xmlns:cx2="http://schemas.microsoft.com/office/drawing/2015/10/21/chartex" xmlns:cx3="http://schemas.microsoft.com/office/drawing/2016/5/9/chartex" xmlns:cx4="http://schemas.microsoft.com/office/drawing/2016/5/10/chartex" xmlns:cx5="http://schemas.microsoft.com/office/drawing/2016/5/11/chartex" xmlns:cx6="http://schemas.microsoft.com/office/drawing/2016/5/12/chartex" xmlns:cx7="http://schemas.microsoft.com/office/drawing/2016/5/13/chartex" xmlns:cx8="http://schemas.microsoft.com/office/drawing/2016/5/14/chartex" xmlns:mc="http://schemas.openxmlformats.org/markup-compatibility/2006" xmlns:m="http://schemas.openxmlformats.org/officeDocument/2006/math" xmlns:aink="http://schemas.microsoft.com/office/drawing/2016/ink" xmlns:am3d="http://schemas.microsoft.com/office/drawing/2017/model3d" xmlns:oel="http://schemas.microsoft.com/office/2019/extlst" xmlns:r="http://schemas.openxmlformats.org/officeDocument/2006/relationships" xmlns:wp14="http://schemas.microsoft.com/office/word/2010/wordprocessingDrawing" xmlns:wp="http://schemas.openxmlformats.org/drawingml/2006/wordprocessingDrawing" xmlns:wpg="http://schemas.microsoft.com/office/word/2010/wordprocessingGroup" xmlns:wpi="http://schemas.microsoft.com/office/word/2010/wordprocessingInk" xmlns:wps="http://schemas.microsoft.com/office/word/2010/wordprocessingShape" xmlns:o="urn:schemas-microsoft-com:office:office" xmlns:v="urn:schemas-microsoft-com:vml" xmlns:w10="urn:schemas-microsoft-com:office:word" xmlns:w="http://schemas.openxmlformats.org/wordprocessingml/2006/main" xmlns:w14="http://schemas.microsoft.com/office/word/2010/wordml" xmlns:w15="http://schemas.microsoft.com/office/word/2012/wordml" xmlns:w16cei="http://schemas.microsoft.com/office/word/2026/wordml/cei" xmlns:w16cex="http://schemas.microsoft.com/office/word/2018/wordml/cex" xmlns:w16cid="http://schemas.microsoft.com/office/word/2016/wordml/cid" xmlns:w16="http://schemas.microsoft.com/office/word/2018/wordml" xmlns:w16sdtdh="http://schemas.microsoft.com/office/word/2020/wordml/sdtdatahash" xmlns:w16sdtfl="http://schemas.microsoft.com/office/word/2024/wordml/sdtformatlock" xmlns:w16se="http://schemas.microsoft.com/office/word/2015/wordml/symex" xmlns:w16du="http://schemas.microsoft.com/office/word/2023/wordml/word16du" xmlns:wne="http://schemas.microsoft.com/office/word/2006/wordml" mc:Ignorable="w14 w15 w16se w16cid w16 w16cex w16sdtdh w16sdtfl w16du wp14">
   <w:abstractNum w:abstractNumId="0" w15:restartNumberingAfterBreak="0">
     <w:nsid w:val="07810D01"/>
     <w:multiLevelType w:val="hybridMultilevel"/>

</xml_diff>

<commit_message>
Fix two dead syllabus links (socviz Ch. 1, Amazon recsys paper)
Co-Authored-By: Claude Fable 5 <noreply@anthropic.com>
</commit_message>
<xml_diff>
--- a/syllabus/mkt566-syllabus-proserpio.docx
+++ b/syllabus/mkt566-syllabus-proserpio.docx
@@ -166,7 +166,7 @@
         <w:t xml:space="preserve"> </w:t>
       </w:r>
       <w:r>
-        <w:t>11:00 – 12:20 pm (16564)</w:t>
+        <w:t>11:00 – 12:20 pm</w:t>
       </w:r>
     </w:p>
     <w:p>
@@ -204,7 +204,13 @@
         <w:t xml:space="preserve"> </w:t>
       </w:r>
       <w:r>
-        <w:t>Tuesdays, 2 – 4 pm or by appointment</w:t>
+        <w:t>Tuesdays, 2 – 4 pm</w:t>
+      </w:r>
+      <w:r>
+        <w:t>,</w:t>
+      </w:r>
+      <w:r>
+        <w:t xml:space="preserve"> or by appointment</w:t>
       </w:r>
     </w:p>
     <w:p>
@@ -222,14 +228,9 @@
         </w:rPr>
         <w:t xml:space="preserve"> </w:t>
       </w:r>
-      <w:hyperlink r:id="rId9" w:history="1">
-        <w:r>
-          <w:rPr>
-            <w:rStyle w:val="Hyperlink"/>
-          </w:rPr>
-          <w:t>proserpi@marshall.usc.edu</w:t>
-        </w:r>
-      </w:hyperlink>
+      <w:r>
+        <w:t>proserpi@marshall.usc.edu</w:t>
+      </w:r>
     </w:p>
     <w:p>
       <w:r>
@@ -239,7 +240,7 @@
         </w:rPr>
         <w:t xml:space="preserve">Class website: </w:t>
       </w:r>
-      <w:hyperlink r:id="rId10" w:history="1">
+      <w:hyperlink r:id="rId9" w:history="1">
         <w:r>
           <w:rPr>
             <w:rStyle w:val="Hyperlink"/>
@@ -614,7 +615,6 @@
         </w:rPr>
         <w:t xml:space="preserve">rovide a working knowledge of data handling and modeling techniques using widely used </w:t>
       </w:r>
-      <w:proofErr w:type="gramStart"/>
       <w:r>
         <w:rPr>
           <w:rFonts w:asciiTheme="minorHAnsi" w:hAnsiTheme="minorHAnsi" w:cstheme="minorHAnsi"/>
@@ -623,7 +623,6 @@
         </w:rPr>
         <w:t>open source</w:t>
       </w:r>
-      <w:proofErr w:type="gramEnd"/>
       <w:r>
         <w:rPr>
           <w:rFonts w:asciiTheme="minorHAnsi" w:hAnsiTheme="minorHAnsi" w:cstheme="minorHAnsi"/>
@@ -1175,7 +1174,7 @@
           <w:szCs w:val="22"/>
         </w:rPr>
       </w:pPr>
-      <w:hyperlink r:id="rId11" w:history="1">
+      <w:hyperlink r:id="rId10" w:history="1">
         <w:r>
           <w:rPr>
             <w:rStyle w:val="Hyperlink"/>
@@ -1208,7 +1207,7 @@
           <w:szCs w:val="22"/>
         </w:rPr>
       </w:pPr>
-      <w:hyperlink r:id="rId12" w:history="1">
+      <w:hyperlink r:id="rId11" w:history="1">
         <w:r>
           <w:rPr>
             <w:rStyle w:val="Hyperlink"/>
@@ -1277,7 +1276,7 @@
           <w:szCs w:val="22"/>
         </w:rPr>
       </w:pPr>
-      <w:hyperlink r:id="rId13" w:history="1">
+      <w:hyperlink r:id="rId12" w:history="1">
         <w:r>
           <w:rPr>
             <w:rStyle w:val="Hyperlink"/>
@@ -1303,7 +1302,7 @@
           <w:szCs w:val="22"/>
         </w:rPr>
       </w:pPr>
-      <w:hyperlink r:id="rId14" w:history="1">
+      <w:hyperlink r:id="rId13" w:history="1">
         <w:r>
           <w:rPr>
             <w:rStyle w:val="Hyperlink"/>
@@ -1329,7 +1328,7 @@
           <w:szCs w:val="22"/>
         </w:rPr>
       </w:pPr>
-      <w:hyperlink r:id="rId15" w:history="1">
+      <w:hyperlink r:id="rId14" w:history="1">
         <w:r>
           <w:rPr>
             <w:rStyle w:val="Hyperlink"/>
@@ -1354,7 +1353,7 @@
           <w:szCs w:val="22"/>
         </w:rPr>
       </w:pPr>
-      <w:hyperlink r:id="rId16" w:history="1">
+      <w:hyperlink r:id="rId15" w:history="1">
         <w:r>
           <w:rPr>
             <w:rStyle w:val="Hyperlink"/>
@@ -1379,7 +1378,7 @@
           <w:szCs w:val="22"/>
         </w:rPr>
       </w:pPr>
-      <w:hyperlink r:id="rId17" w:history="1">
+      <w:hyperlink r:id="rId16" w:history="1">
         <w:r>
           <w:rPr>
             <w:rStyle w:val="Hyperlink"/>
@@ -1404,7 +1403,7 @@
           <w:szCs w:val="22"/>
         </w:rPr>
       </w:pPr>
-      <w:hyperlink r:id="rId18" w:history="1">
+      <w:hyperlink r:id="rId17" w:history="1">
         <w:r>
           <w:rPr>
             <w:rStyle w:val="Hyperlink"/>
@@ -1468,7 +1467,7 @@
           <w:szCs w:val="22"/>
         </w:rPr>
       </w:pPr>
-      <w:hyperlink r:id="rId19" w:history="1">
+      <w:hyperlink r:id="rId18" w:history="1">
         <w:r>
           <w:rPr>
             <w:rStyle w:val="Hyperlink"/>
@@ -1542,7 +1541,7 @@
           <w:szCs w:val="22"/>
         </w:rPr>
       </w:pPr>
-      <w:hyperlink r:id="rId20" w:history="1">
+      <w:hyperlink r:id="rId19" w:history="1">
         <w:r>
           <w:rPr>
             <w:rStyle w:val="Hyperlink"/>
@@ -1618,7 +1617,7 @@
       <w:r>
         <w:t xml:space="preserve">Recommended IDE: </w:t>
       </w:r>
-      <w:hyperlink r:id="rId21" w:history="1">
+      <w:hyperlink r:id="rId20" w:history="1">
         <w:r>
           <w:rPr>
             <w:rStyle w:val="Hyperlink"/>
@@ -1641,26 +1640,14 @@
       <w:r>
         <w:t>/</w:t>
       </w:r>
-      <w:proofErr w:type="spellStart"/>
-      <w:r>
-        <w:fldChar w:fldCharType="begin"/>
-      </w:r>
-      <w:r>
-        <w:instrText>HYPERLINK "https://code.visualstudio.com/"</w:instrText>
-      </w:r>
-      <w:r>
-        <w:fldChar w:fldCharType="separate"/>
-      </w:r>
-      <w:r>
-        <w:rPr>
-          <w:rStyle w:val="Hyperlink"/>
-        </w:rPr>
-        <w:t>VSCode</w:t>
-      </w:r>
-      <w:proofErr w:type="spellEnd"/>
-      <w:r>
-        <w:fldChar w:fldCharType="end"/>
-      </w:r>
+      <w:hyperlink r:id="rId21" w:history="1">
+        <w:r>
+          <w:rPr>
+            <w:rStyle w:val="Hyperlink"/>
+          </w:rPr>
+          <w:t>VSCode</w:t>
+        </w:r>
+      </w:hyperlink>
     </w:p>
     <w:p/>
     <w:p>
@@ -1873,11 +1860,7 @@
           </w:tcPr>
           <w:p>
             <w:r>
-              <w:t xml:space="preserve">Individual </w:t>
-            </w:r>
-            <w:proofErr w:type="spellStart"/>
-            <w:r>
-              <w:t>h</w:t>
+              <w:t>Individual h</w:t>
             </w:r>
             <w:r>
               <w:t>omework</w:t>
@@ -1885,7 +1868,6 @@
             <w:r>
               <w:t>s</w:t>
             </w:r>
-            <w:proofErr w:type="spellEnd"/>
             <w:r>
               <w:t xml:space="preserve"> (4</w:t>
             </w:r>
@@ -2156,23 +2138,13 @@
           <w:szCs w:val="22"/>
         </w:rPr>
       </w:pPr>
-      <w:proofErr w:type="gramStart"/>
-      <w:r>
-        <w:rPr>
-          <w:rFonts w:asciiTheme="minorHAnsi" w:hAnsiTheme="minorHAnsi" w:cstheme="minorHAnsi"/>
-          <w:sz w:val="22"/>
-          <w:szCs w:val="22"/>
-        </w:rPr>
-        <w:t>Your</w:t>
-      </w:r>
-      <w:proofErr w:type="gramEnd"/>
-      <w:r>
-        <w:rPr>
-          <w:rFonts w:asciiTheme="minorHAnsi" w:hAnsiTheme="minorHAnsi" w:cstheme="minorHAnsi"/>
-          <w:sz w:val="22"/>
-          <w:szCs w:val="22"/>
-        </w:rPr>
-        <w:t xml:space="preserve"> ranking among all students in the class.</w:t>
+      <w:r>
+        <w:rPr>
+          <w:rFonts w:asciiTheme="minorHAnsi" w:hAnsiTheme="minorHAnsi" w:cstheme="minorHAnsi"/>
+          <w:sz w:val="22"/>
+          <w:szCs w:val="22"/>
+        </w:rPr>
+        <w:t>Your ranking among all students in the class.</w:t>
       </w:r>
     </w:p>
     <w:p/>
@@ -2573,25 +2545,7 @@
           <w:sz w:val="22"/>
           <w:szCs w:val="22"/>
         </w:rPr>
-        <w:t xml:space="preserve">assignments that are sufficiently late </w:t>
-      </w:r>
-      <w:proofErr w:type="gramStart"/>
-      <w:r>
-        <w:rPr>
-          <w:rFonts w:ascii="Calibri" w:hAnsi="Calibri" w:cs="Calibri"/>
-          <w:sz w:val="22"/>
-          <w:szCs w:val="22"/>
-        </w:rPr>
-        <w:t>so as to</w:t>
-      </w:r>
-      <w:proofErr w:type="gramEnd"/>
-      <w:r>
-        <w:rPr>
-          <w:rFonts w:ascii="Calibri" w:hAnsi="Calibri" w:cs="Calibri"/>
-          <w:sz w:val="22"/>
-          <w:szCs w:val="22"/>
-        </w:rPr>
-        <w:t xml:space="preserve"> have benefited from class discussion get no credit.</w:t>
+        <w:t>assignments that are sufficiently late so as to have benefited from class discussion get no credit.</w:t>
       </w:r>
       <w:r>
         <w:rPr>
@@ -4310,9 +4264,24 @@
           <w:sz w:val="22"/>
           <w:szCs w:val="22"/>
         </w:rPr>
-        <w:t xml:space="preserve">Please include a paragraph at the end of any assignment that uses AI explaining how (and why) you used </w:t>
-      </w:r>
-      <w:proofErr w:type="gramStart"/>
+        <w:t>Please include a paragraph at the end of any assignment that uses AI explaining how (and why) you used AI</w:t>
+      </w:r>
+      <w:r>
+        <w:rPr>
+          <w:rFonts w:ascii="Calibri" w:hAnsi="Calibri" w:cs="Calibri"/>
+          <w:sz w:val="22"/>
+          <w:szCs w:val="22"/>
+        </w:rPr>
+        <w:t>,</w:t>
+      </w:r>
+      <w:r>
+        <w:rPr>
+          <w:rFonts w:ascii="Calibri" w:hAnsi="Calibri" w:cs="Calibri"/>
+          <w:sz w:val="22"/>
+          <w:szCs w:val="22"/>
+        </w:rPr>
+        <w:t xml:space="preserve"> </w:t>
+      </w:r>
       <w:r>
         <w:rPr>
           <w:rFonts w:ascii="Calibri" w:hAnsi="Calibri" w:cs="Calibri"/>
@@ -4321,44 +4290,7 @@
           <w:sz w:val="22"/>
           <w:szCs w:val="22"/>
         </w:rPr>
-        <w:t>AI</w:t>
-      </w:r>
-      <w:r>
-        <w:rPr>
-          <w:rFonts w:ascii="Calibri" w:hAnsi="Calibri" w:cs="Calibri"/>
-          <w:sz w:val="22"/>
-          <w:szCs w:val="22"/>
-        </w:rPr>
-        <w:t>,</w:t>
-      </w:r>
-      <w:r>
-        <w:rPr>
-          <w:rFonts w:ascii="Calibri" w:hAnsi="Calibri" w:cs="Calibri"/>
-          <w:sz w:val="22"/>
-          <w:szCs w:val="22"/>
-        </w:rPr>
-        <w:t xml:space="preserve"> </w:t>
-      </w:r>
-      <w:r>
-        <w:rPr>
-          <w:rFonts w:ascii="Calibri" w:hAnsi="Calibri" w:cs="Calibri"/>
-          <w:b/>
-          <w:bCs/>
-          <w:sz w:val="22"/>
-          <w:szCs w:val="22"/>
-        </w:rPr>
-        <w:t>and</w:t>
-      </w:r>
-      <w:proofErr w:type="gramEnd"/>
-      <w:r>
-        <w:rPr>
-          <w:rFonts w:ascii="Calibri" w:hAnsi="Calibri" w:cs="Calibri"/>
-          <w:b/>
-          <w:bCs/>
-          <w:sz w:val="22"/>
-          <w:szCs w:val="22"/>
-        </w:rPr>
-        <w:t xml:space="preserve"> indicate/specify the prompts you used to obtain the results and what prompts you used to get the results</w:t>
+        <w:t>and indicate/specify the prompts you used to obtain the results and what prompts you used to get the results</w:t>
       </w:r>
       <w:r>
         <w:rPr>
@@ -5064,17 +4996,7 @@
                   <w:sz w:val="20"/>
                   <w:szCs w:val="20"/>
                 </w:rPr>
-                <w:t xml:space="preserve">Chapter 1 </w:t>
-              </w:r>
-              <w:proofErr w:type="gramStart"/>
-              <w:r>
-                <w:rPr>
-                  <w:rStyle w:val="Hyperlink"/>
-                  <w:rFonts w:asciiTheme="minorHAnsi" w:eastAsiaTheme="majorEastAsia" w:hAnsiTheme="minorHAnsi" w:cstheme="minorHAnsi"/>
-                  <w:sz w:val="20"/>
-                  <w:szCs w:val="20"/>
-                </w:rPr>
-                <w:t xml:space="preserve">of </w:t>
+                <w:t xml:space="preserve">Chapter 1 of </w:t>
               </w:r>
               <w:r>
                 <w:rPr>
@@ -5092,17 +5014,7 @@
                   <w:sz w:val="20"/>
                   <w:szCs w:val="20"/>
                 </w:rPr>
-                <w:t>Data</w:t>
-              </w:r>
-              <w:proofErr w:type="gramEnd"/>
-              <w:r>
-                <w:rPr>
-                  <w:rStyle w:val="Hyperlink"/>
-                  <w:rFonts w:asciiTheme="minorHAnsi" w:eastAsiaTheme="majorEastAsia" w:hAnsiTheme="minorHAnsi" w:cstheme="minorHAnsi"/>
-                  <w:sz w:val="20"/>
-                  <w:szCs w:val="20"/>
-                </w:rPr>
-                <w:t xml:space="preserve"> Visualization: A practical introduction</w:t>
+                <w:t>Data Visualization: A practical introduction</w:t>
               </w:r>
             </w:hyperlink>
           </w:p>
@@ -5565,25 +5477,7 @@
                 <w:sz w:val="20"/>
                 <w:szCs w:val="20"/>
               </w:rPr>
-              <w:t xml:space="preserve"> (</w:t>
-            </w:r>
-            <w:proofErr w:type="spellStart"/>
-            <w:r>
-              <w:rPr>
-                <w:rFonts w:asciiTheme="minorHAnsi" w:hAnsiTheme="minorHAnsi" w:cstheme="minorHAnsi"/>
-                <w:sz w:val="20"/>
-                <w:szCs w:val="20"/>
-              </w:rPr>
-              <w:t>RateBeer</w:t>
-            </w:r>
-            <w:proofErr w:type="spellEnd"/>
-            <w:r>
-              <w:rPr>
-                <w:rFonts w:asciiTheme="minorHAnsi" w:hAnsiTheme="minorHAnsi" w:cstheme="minorHAnsi"/>
-                <w:sz w:val="20"/>
-                <w:szCs w:val="20"/>
-              </w:rPr>
-              <w:t>)</w:t>
+              <w:t xml:space="preserve"> (RateBeer)</w:t>
             </w:r>
           </w:p>
         </w:tc>
@@ -6439,7 +6333,6 @@
                 <w:szCs w:val="20"/>
               </w:rPr>
             </w:pPr>
-            <w:proofErr w:type="spellStart"/>
             <w:r>
               <w:rPr>
                 <w:sz w:val="20"/>
@@ -6469,17 +6362,7 @@
                   <w:sz w:val="20"/>
                   <w:szCs w:val="20"/>
                 </w:rPr>
-                <w:t>Marketing</w:t>
-              </w:r>
-              <w:proofErr w:type="spellEnd"/>
-              <w:r>
-                <w:rPr>
-                  <w:rStyle w:val="Hyperlink"/>
-                  <w:rFonts w:asciiTheme="minorHAnsi" w:hAnsiTheme="minorHAnsi" w:cstheme="minorHAnsi"/>
-                  <w:sz w:val="20"/>
-                  <w:szCs w:val="20"/>
-                </w:rPr>
-                <w:t xml:space="preserve"> </w:t>
+                <w:t xml:space="preserve">Marketing </w:t>
               </w:r>
               <w:r>
                 <w:rPr>
@@ -7413,17 +7296,7 @@
                   <w:sz w:val="20"/>
                   <w:szCs w:val="20"/>
                 </w:rPr>
-                <w:t xml:space="preserve">Chapter 8 </w:t>
-              </w:r>
-              <w:proofErr w:type="gramStart"/>
-              <w:r>
-                <w:rPr>
-                  <w:rStyle w:val="Hyperlink"/>
-                  <w:rFonts w:asciiTheme="minorHAnsi" w:eastAsia="Times New Roman" w:hAnsiTheme="minorHAnsi" w:cstheme="minorHAnsi"/>
-                  <w:sz w:val="20"/>
-                  <w:szCs w:val="20"/>
-                </w:rPr>
-                <w:t xml:space="preserve">of </w:t>
+                <w:t xml:space="preserve">Chapter 8 of </w:t>
               </w:r>
               <w:r>
                 <w:rPr>
@@ -7441,17 +7314,7 @@
                   <w:sz w:val="20"/>
                   <w:szCs w:val="20"/>
                 </w:rPr>
-                <w:t>Introduction</w:t>
-              </w:r>
-              <w:proofErr w:type="gramEnd"/>
-              <w:r>
-                <w:rPr>
-                  <w:rStyle w:val="Hyperlink"/>
-                  <w:rFonts w:asciiTheme="minorHAnsi" w:eastAsia="Times New Roman" w:hAnsiTheme="minorHAnsi" w:cstheme="minorHAnsi"/>
-                  <w:sz w:val="20"/>
-                  <w:szCs w:val="20"/>
-                </w:rPr>
-                <w:t xml:space="preserve"> to R for Data Science</w:t>
+                <w:t>Introduction to R for Data Science</w:t>
               </w:r>
             </w:hyperlink>
           </w:p>
@@ -7647,27 +7510,7 @@
                   <w:sz w:val="20"/>
                   <w:szCs w:val="20"/>
                 </w:rPr>
-                <w:t xml:space="preserve">Fake It </w:t>
-              </w:r>
-              <w:proofErr w:type="gramStart"/>
-              <w:r>
-                <w:rPr>
-                  <w:rStyle w:val="Hyperlink"/>
-                  <w:rFonts w:ascii="Calibri" w:hAnsi="Calibri" w:cs="Calibri"/>
-                  <w:sz w:val="20"/>
-                  <w:szCs w:val="20"/>
-                </w:rPr>
-                <w:t>Till</w:t>
-              </w:r>
-              <w:proofErr w:type="gramEnd"/>
-              <w:r>
-                <w:rPr>
-                  <w:rStyle w:val="Hyperlink"/>
-                  <w:rFonts w:ascii="Calibri" w:hAnsi="Calibri" w:cs="Calibri"/>
-                  <w:sz w:val="20"/>
-                  <w:szCs w:val="20"/>
-                </w:rPr>
-                <w:t xml:space="preserve"> You Make It: Reputation, Competition, and Yelp Review Fraud</w:t>
+                <w:t>Fake It Till You Make It: Reputation, Competition, and Yelp Review Fraud</w:t>
               </w:r>
             </w:hyperlink>
           </w:p>
@@ -10582,15 +10425,7 @@
     </w:p>
     <w:p>
       <w:r>
-        <w:t xml:space="preserve">USC welcomes students with disabilities into </w:t>
-      </w:r>
-      <w:proofErr w:type="gramStart"/>
-      <w:r>
-        <w:t>all of</w:t>
-      </w:r>
-      <w:proofErr w:type="gramEnd"/>
-      <w:r>
-        <w:t xml:space="preserve"> the University’s educational programs. </w:t>
+        <w:t xml:space="preserve">USC welcomes students with disabilities into all of the University’s educational programs. </w:t>
       </w:r>
       <w:hyperlink r:id="rId54">
         <w:r>
@@ -10864,15 +10699,7 @@
         </w:rPr>
       </w:pPr>
       <w:r>
-        <w:t xml:space="preserve">Confidential advocates, prevention educators, and professional counseling teams work to promote a universal culture of </w:t>
-      </w:r>
-      <w:proofErr w:type="gramStart"/>
-      <w:r>
-        <w:t>consent, and</w:t>
-      </w:r>
-      <w:proofErr w:type="gramEnd"/>
-      <w:r>
-        <w:t xml:space="preserve"> prevent and respond to gender- and power-based harm. Services available to all USC students at no cost.</w:t>
+        <w:t>Confidential advocates, prevention educators, and professional counseling teams work to promote a universal culture of consent, and prevent and respond to gender- and power-based harm. Services available to all USC students at no cost.</w:t>
       </w:r>
       <w:r>
         <w:fldChar w:fldCharType="begin"/>
@@ -10914,15 +10741,7 @@
     </w:p>
     <w:p>
       <w:r>
-        <w:t xml:space="preserve">Information about how to get help or help someone affected by harassment, discrimination, retaliation </w:t>
-      </w:r>
-      <w:proofErr w:type="gramStart"/>
-      <w:r>
-        <w:t>on the basis of</w:t>
-      </w:r>
-      <w:proofErr w:type="gramEnd"/>
-      <w:r>
-        <w:t xml:space="preserve"> a protected characteristic, rights of protected classes, reporting options, and additional resources for students, faculty, staff, visitors, and applicants. </w:t>
+        <w:t xml:space="preserve">Information about how to get help or help someone affected by harassment, discrimination, retaliation on the basis of a protected characteristic, rights of protected classes, reporting options, and additional resources for students, faculty, staff, visitors, and applicants. </w:t>
       </w:r>
     </w:p>
     <w:p/>
@@ -11086,15 +10905,7 @@
     </w:p>
     <w:p>
       <w:r>
-        <w:t xml:space="preserve">For </w:t>
-      </w:r>
-      <w:proofErr w:type="gramStart"/>
-      <w:r>
-        <w:t>24 hour</w:t>
-      </w:r>
-      <w:proofErr w:type="gramEnd"/>
-      <w:r>
-        <w:t xml:space="preserve"> emergency assistance or to report a crime: UPC: (213) 740-4321, HSC: (323)-442-1000.</w:t>
+        <w:t>For 24 hour emergency assistance or to report a crime: UPC: (213) 740-4321, HSC: (323)-442-1000.</w:t>
       </w:r>
     </w:p>
     <w:p>
@@ -11108,15 +10919,7 @@
         </w:rPr>
       </w:pPr>
       <w:r>
-        <w:t xml:space="preserve">For </w:t>
-      </w:r>
-      <w:proofErr w:type="gramStart"/>
-      <w:r>
-        <w:t>24 hour</w:t>
-      </w:r>
-      <w:proofErr w:type="gramEnd"/>
-      <w:r>
-        <w:t xml:space="preserve"> non-emergency assistance or information: UPC: (213) 740-6000, HSC: 323-442-1200.</w:t>
+        <w:t>For 24 hour non-emergency assistance or information: UPC: (213) 740-6000, HSC: 323-442-1200.</w:t>
       </w:r>
     </w:p>
     <w:p/>
@@ -11357,21 +11160,7 @@
         <w:rPr>
           <w:rFonts w:asciiTheme="minorHAnsi" w:hAnsiTheme="minorHAnsi" w:cstheme="minorHAnsi"/>
         </w:rPr>
-        <w:t xml:space="preserve"> of interest. As a first step, you </w:t>
-      </w:r>
-      <w:proofErr w:type="gramStart"/>
-      <w:r>
-        <w:rPr>
-          <w:rFonts w:asciiTheme="minorHAnsi" w:hAnsiTheme="minorHAnsi" w:cstheme="minorHAnsi"/>
-        </w:rPr>
-        <w:t>have to</w:t>
-      </w:r>
-      <w:proofErr w:type="gramEnd"/>
-      <w:r>
-        <w:rPr>
-          <w:rFonts w:asciiTheme="minorHAnsi" w:hAnsiTheme="minorHAnsi" w:cstheme="minorHAnsi"/>
-        </w:rPr>
-        <w:t xml:space="preserve"> select a project of interest for your</w:t>
+        <w:t xml:space="preserve"> of interest. As a first step, you have to select a project of interest for your</w:t>
       </w:r>
     </w:p>
     <w:p>
@@ -11409,21 +11198,7 @@
         <w:rPr>
           <w:rFonts w:asciiTheme="minorHAnsi" w:hAnsiTheme="minorHAnsi" w:cstheme="minorHAnsi"/>
         </w:rPr>
-        <w:t xml:space="preserve">is not </w:t>
-      </w:r>
-      <w:proofErr w:type="gramStart"/>
-      <w:r>
-        <w:rPr>
-          <w:rFonts w:asciiTheme="minorHAnsi" w:hAnsiTheme="minorHAnsi" w:cstheme="minorHAnsi"/>
-        </w:rPr>
-        <w:t>absolutely necessary</w:t>
-      </w:r>
-      <w:proofErr w:type="gramEnd"/>
-      <w:r>
-        <w:rPr>
-          <w:rFonts w:asciiTheme="minorHAnsi" w:hAnsiTheme="minorHAnsi" w:cstheme="minorHAnsi"/>
-        </w:rPr>
-        <w:t>. The project should be related to material covered in the course and</w:t>
+        <w:t>is not absolutely necessary. The project should be related to material covered in the course and</w:t>
       </w:r>
     </w:p>
     <w:p>
@@ -12009,23 +11784,13 @@
           <w:szCs w:val="22"/>
         </w:rPr>
       </w:pPr>
-      <w:proofErr w:type="gramStart"/>
-      <w:r>
-        <w:rPr>
-          <w:rFonts w:asciiTheme="minorHAnsi" w:hAnsiTheme="minorHAnsi" w:cstheme="minorHAnsi"/>
-          <w:sz w:val="22"/>
-          <w:szCs w:val="22"/>
-        </w:rPr>
-        <w:t>A brief summary</w:t>
-      </w:r>
-      <w:proofErr w:type="gramEnd"/>
-      <w:r>
-        <w:rPr>
-          <w:rFonts w:asciiTheme="minorHAnsi" w:hAnsiTheme="minorHAnsi" w:cstheme="minorHAnsi"/>
-          <w:sz w:val="22"/>
-          <w:szCs w:val="22"/>
-        </w:rPr>
-        <w:t xml:space="preserve"> of the results</w:t>
+      <w:r>
+        <w:rPr>
+          <w:rFonts w:asciiTheme="minorHAnsi" w:hAnsiTheme="minorHAnsi" w:cstheme="minorHAnsi"/>
+          <w:sz w:val="22"/>
+          <w:szCs w:val="22"/>
+        </w:rPr>
+        <w:t>A brief summary of the results</w:t>
       </w:r>
     </w:p>
     <w:p>

</xml_diff>

<commit_message>
Set final exam date (Tue Dec 15, 8-10 am), peer evals due on exam date, move HW4 due note to week 13
Co-Authored-By: Claude Fable 5 <noreply@anthropic.com>
</commit_message>
<xml_diff>
--- a/syllabus/mkt566-syllabus-proserpio.docx
+++ b/syllabus/mkt566-syllabus-proserpio.docx
@@ -8126,42 +8126,6 @@
                 <w:szCs w:val="20"/>
               </w:rPr>
             </w:pPr>
-            <w:r>
-              <w:rPr>
-                <w:rFonts w:asciiTheme="minorHAnsi" w:hAnsiTheme="minorHAnsi" w:cstheme="minorHAnsi"/>
-                <w:color w:val="000000" w:themeColor="text1"/>
-                <w:sz w:val="20"/>
-                <w:szCs w:val="20"/>
-              </w:rPr>
-              <w:t>Homework 4 due on No</w:t>
-            </w:r>
-            <w:r>
-              <w:rPr>
-                <w:rFonts w:asciiTheme="minorHAnsi" w:hAnsiTheme="minorHAnsi" w:cstheme="minorHAnsi"/>
-                <w:color w:val="000000" w:themeColor="text1"/>
-                <w:sz w:val="20"/>
-                <w:szCs w:val="20"/>
-              </w:rPr>
-              <w:t>v.</w:t>
-            </w:r>
-            <w:r>
-              <w:rPr>
-                <w:rFonts w:asciiTheme="minorHAnsi" w:hAnsiTheme="minorHAnsi" w:cstheme="minorHAnsi"/>
-                <w:color w:val="000000" w:themeColor="text1"/>
-                <w:sz w:val="20"/>
-                <w:szCs w:val="20"/>
-              </w:rPr>
-              <w:t xml:space="preserve"> 1</w:t>
-            </w:r>
-            <w:r>
-              <w:rPr>
-                <w:rFonts w:asciiTheme="minorHAnsi" w:hAnsiTheme="minorHAnsi" w:cstheme="minorHAnsi"/>
-                <w:color w:val="000000" w:themeColor="text1"/>
-                <w:sz w:val="20"/>
-                <w:szCs w:val="20"/>
-              </w:rPr>
-              <w:t>9</w:t>
-            </w:r>
           </w:p>
         </w:tc>
       </w:tr>
@@ -8370,6 +8334,42 @@
                 <w:szCs w:val="20"/>
               </w:rPr>
             </w:pPr>
+            <w:r>
+              <w:rPr>
+                <w:rFonts w:asciiTheme="minorHAnsi" w:hAnsiTheme="minorHAnsi" w:cstheme="minorHAnsi"/>
+                <w:color w:val="000000" w:themeColor="text1"/>
+                <w:sz w:val="20"/>
+                <w:szCs w:val="20"/>
+              </w:rPr>
+              <w:t>Homework 4 due on No</w:t>
+            </w:r>
+            <w:r>
+              <w:rPr>
+                <w:rFonts w:asciiTheme="minorHAnsi" w:hAnsiTheme="minorHAnsi" w:cstheme="minorHAnsi"/>
+                <w:color w:val="000000" w:themeColor="text1"/>
+                <w:sz w:val="20"/>
+                <w:szCs w:val="20"/>
+              </w:rPr>
+              <w:t>v.</w:t>
+            </w:r>
+            <w:r>
+              <w:rPr>
+                <w:rFonts w:asciiTheme="minorHAnsi" w:hAnsiTheme="minorHAnsi" w:cstheme="minorHAnsi"/>
+                <w:color w:val="000000" w:themeColor="text1"/>
+                <w:sz w:val="20"/>
+                <w:szCs w:val="20"/>
+              </w:rPr>
+              <w:t xml:space="preserve"> 1</w:t>
+            </w:r>
+            <w:r>
+              <w:rPr>
+                <w:rFonts w:asciiTheme="minorHAnsi" w:hAnsiTheme="minorHAnsi" w:cstheme="minorHAnsi"/>
+                <w:color w:val="000000" w:themeColor="text1"/>
+                <w:sz w:val="20"/>
+                <w:szCs w:val="20"/>
+              </w:rPr>
+              <w:t>9</w:t>
+            </w:r>
           </w:p>
         </w:tc>
       </w:tr>
@@ -8739,7 +8739,7 @@
                 <w:sz w:val="20"/>
                 <w:szCs w:val="20"/>
               </w:rPr>
-              <w:t>TBD (per USC final exam schedule)</w:t>
+              <w:t>Tue, Dec. 15, 8:00–10:00 am (per USC final exam schedule)</w:t>
             </w:r>
           </w:p>
         </w:tc>
@@ -8761,7 +8761,7 @@
                 <w:sz w:val="20"/>
                 <w:szCs w:val="20"/>
               </w:rPr>
-              <w:t>Section 16564: TBD</w:t>
+              <w:t>Section 16564: Tue, Dec. 15, 8:00–10:00 am</w:t>
             </w:r>
           </w:p>
           <w:p>
@@ -8806,7 +8806,7 @@
                 <w:sz w:val="20"/>
                 <w:szCs w:val="20"/>
               </w:rPr>
-              <w:t xml:space="preserve">Peer evals due on the final exam date </w:t>
+              <w:t xml:space="preserve">Peer evals due on the final exam date (Dec. 15) </w:t>
             </w:r>
             <w:r>
               <w:rPr>

</xml_diff>

<commit_message>
Add LLM tools (Claude, ChatGPT) to required software in syllabus
Co-Authored-By: Claude Fable 5 <noreply@anthropic.com>
</commit_message>
<xml_diff>
--- a/syllabus/mkt566-syllabus-proserpio.docx
+++ b/syllabus/mkt566-syllabus-proserpio.docx
@@ -1648,6 +1648,11 @@
           <w:t>VSCode</w:t>
         </w:r>
       </w:hyperlink>
+    </w:p>
+    <w:p>
+      <w:r>
+        <w:t xml:space="preserve">LLM tools: LLMs such as Claude or ChatGPT are also required</w:t>
+      </w:r>
     </w:p>
     <w:p/>
     <w:p>

</xml_diff>

<commit_message>
Syllabus: link VS Code website from the recommended-IDE line; regenerate PDF
Co-Authored-By: Claude Fable 5 <noreply@anthropic.com>
</commit_message>
<xml_diff>
--- a/syllabus/mkt566-syllabus-proserpio.docx
+++ b/syllabus/mkt566-syllabus-proserpio.docx
@@ -259,8 +259,13 @@
         <w:t>Teaching Assistant:</w:t>
       </w:r>
       <w:r>
-        <w:t xml:space="preserve"> Raghav Sarmukaddam</w:t>
-      </w:r>
+        <w:t xml:space="preserve"> Raghav </w:t>
+      </w:r>
+      <w:proofErr w:type="spellStart"/>
+      <w:r>
+        <w:t>Sarmukaddam</w:t>
+      </w:r>
+      <w:proofErr w:type="spellEnd"/>
     </w:p>
     <w:p>
       <w:r>
@@ -615,6 +620,7 @@
         </w:rPr>
         <w:t xml:space="preserve">rovide a working knowledge of data handling and modeling techniques using widely used </w:t>
       </w:r>
+      <w:proofErr w:type="gramStart"/>
       <w:r>
         <w:rPr>
           <w:rFonts w:asciiTheme="minorHAnsi" w:hAnsiTheme="minorHAnsi" w:cstheme="minorHAnsi"/>
@@ -623,6 +629,7 @@
         </w:rPr>
         <w:t>open source</w:t>
       </w:r>
+      <w:proofErr w:type="gramEnd"/>
       <w:r>
         <w:rPr>
           <w:rFonts w:asciiTheme="minorHAnsi" w:hAnsiTheme="minorHAnsi" w:cstheme="minorHAnsi"/>
@@ -1640,18 +1647,30 @@
       <w:r>
         <w:t>/</w:t>
       </w:r>
-      <w:hyperlink r:id="rId21" w:history="1">
-        <w:r>
-          <w:rPr>
-            <w:rStyle w:val="Hyperlink"/>
-          </w:rPr>
-          <w:t>VSCode</w:t>
-        </w:r>
-      </w:hyperlink>
-    </w:p>
-    <w:p>
-      <w:r>
-        <w:t xml:space="preserve">LLM tools: LLMs such as Claude or ChatGPT are also required</w:t>
+      <w:proofErr w:type="spellStart"/>
+      <w:r>
+        <w:fldChar w:fldCharType="begin"/>
+      </w:r>
+      <w:r>
+        <w:instrText>HYPERLINK "https://code.visualstudio.com/"</w:instrText>
+      </w:r>
+      <w:r>
+        <w:fldChar w:fldCharType="separate"/>
+      </w:r>
+      <w:r>
+        <w:rPr>
+          <w:rStyle w:val="Hyperlink"/>
+        </w:rPr>
+        <w:t>VSCode</w:t>
+      </w:r>
+      <w:proofErr w:type="spellEnd"/>
+      <w:r>
+        <w:fldChar w:fldCharType="end"/>
+      </w:r>
+    </w:p>
+    <w:p>
+      <w:r>
+        <w:t>LLM tools: LLMs such as Claude or ChatGPT are also required</w:t>
       </w:r>
     </w:p>
     <w:p/>
@@ -1865,7 +1884,11 @@
           </w:tcPr>
           <w:p>
             <w:r>
-              <w:t>Individual h</w:t>
+              <w:t xml:space="preserve">Individual </w:t>
+            </w:r>
+            <w:proofErr w:type="spellStart"/>
+            <w:r>
+              <w:t>h</w:t>
             </w:r>
             <w:r>
               <w:t>omework</w:t>
@@ -1873,6 +1896,7 @@
             <w:r>
               <w:t>s</w:t>
             </w:r>
+            <w:proofErr w:type="spellEnd"/>
             <w:r>
               <w:t xml:space="preserve"> (4</w:t>
             </w:r>
@@ -2069,6 +2093,7 @@
         <w:rPr>
           <w:rFonts w:asciiTheme="minorHAnsi" w:hAnsiTheme="minorHAnsi" w:cstheme="minorHAnsi"/>
         </w:rPr>
+        <w:lastRenderedPageBreak/>
         <w:t>grade for a graduate elective class at USC Marshall is about a B+. Three items are considered</w:t>
       </w:r>
     </w:p>
@@ -2082,7 +2107,6 @@
         <w:rPr>
           <w:rFonts w:asciiTheme="minorHAnsi" w:hAnsiTheme="minorHAnsi" w:cstheme="minorHAnsi"/>
         </w:rPr>
-        <w:lastRenderedPageBreak/>
         <w:t>when assigning final grades:</w:t>
       </w:r>
     </w:p>
@@ -2143,13 +2167,23 @@
           <w:szCs w:val="22"/>
         </w:rPr>
       </w:pPr>
-      <w:r>
-        <w:rPr>
-          <w:rFonts w:asciiTheme="minorHAnsi" w:hAnsiTheme="minorHAnsi" w:cstheme="minorHAnsi"/>
-          <w:sz w:val="22"/>
-          <w:szCs w:val="22"/>
-        </w:rPr>
-        <w:t>Your ranking among all students in the class.</w:t>
+      <w:proofErr w:type="gramStart"/>
+      <w:r>
+        <w:rPr>
+          <w:rFonts w:asciiTheme="minorHAnsi" w:hAnsiTheme="minorHAnsi" w:cstheme="minorHAnsi"/>
+          <w:sz w:val="22"/>
+          <w:szCs w:val="22"/>
+        </w:rPr>
+        <w:t>Your</w:t>
+      </w:r>
+      <w:proofErr w:type="gramEnd"/>
+      <w:r>
+        <w:rPr>
+          <w:rFonts w:asciiTheme="minorHAnsi" w:hAnsiTheme="minorHAnsi" w:cstheme="minorHAnsi"/>
+          <w:sz w:val="22"/>
+          <w:szCs w:val="22"/>
+        </w:rPr>
+        <w:t xml:space="preserve"> ranking among all students in the class.</w:t>
       </w:r>
     </w:p>
     <w:p/>
@@ -2550,7 +2584,25 @@
           <w:sz w:val="22"/>
           <w:szCs w:val="22"/>
         </w:rPr>
-        <w:t>assignments that are sufficiently late so as to have benefited from class discussion get no credit.</w:t>
+        <w:t xml:space="preserve">assignments that are sufficiently late </w:t>
+      </w:r>
+      <w:proofErr w:type="gramStart"/>
+      <w:r>
+        <w:rPr>
+          <w:rFonts w:ascii="Calibri" w:hAnsi="Calibri" w:cs="Calibri"/>
+          <w:sz w:val="22"/>
+          <w:szCs w:val="22"/>
+        </w:rPr>
+        <w:t>so as to</w:t>
+      </w:r>
+      <w:proofErr w:type="gramEnd"/>
+      <w:r>
+        <w:rPr>
+          <w:rFonts w:ascii="Calibri" w:hAnsi="Calibri" w:cs="Calibri"/>
+          <w:sz w:val="22"/>
+          <w:szCs w:val="22"/>
+        </w:rPr>
+        <w:t xml:space="preserve"> have benefited from class discussion get no credit.</w:t>
       </w:r>
       <w:r>
         <w:rPr>
@@ -4269,24 +4321,9 @@
           <w:sz w:val="22"/>
           <w:szCs w:val="22"/>
         </w:rPr>
-        <w:t>Please include a paragraph at the end of any assignment that uses AI explaining how (and why) you used AI</w:t>
-      </w:r>
-      <w:r>
-        <w:rPr>
-          <w:rFonts w:ascii="Calibri" w:hAnsi="Calibri" w:cs="Calibri"/>
-          <w:sz w:val="22"/>
-          <w:szCs w:val="22"/>
-        </w:rPr>
-        <w:t>,</w:t>
-      </w:r>
-      <w:r>
-        <w:rPr>
-          <w:rFonts w:ascii="Calibri" w:hAnsi="Calibri" w:cs="Calibri"/>
-          <w:sz w:val="22"/>
-          <w:szCs w:val="22"/>
-        </w:rPr>
-        <w:t xml:space="preserve"> </w:t>
-      </w:r>
+        <w:t xml:space="preserve">Please include a paragraph at the end of any assignment that uses AI explaining how (and why) you used </w:t>
+      </w:r>
+      <w:proofErr w:type="gramStart"/>
       <w:r>
         <w:rPr>
           <w:rFonts w:ascii="Calibri" w:hAnsi="Calibri" w:cs="Calibri"/>
@@ -4295,7 +4332,44 @@
           <w:sz w:val="22"/>
           <w:szCs w:val="22"/>
         </w:rPr>
-        <w:t>and indicate/specify the prompts you used to obtain the results and what prompts you used to get the results</w:t>
+        <w:t>AI</w:t>
+      </w:r>
+      <w:r>
+        <w:rPr>
+          <w:rFonts w:ascii="Calibri" w:hAnsi="Calibri" w:cs="Calibri"/>
+          <w:sz w:val="22"/>
+          <w:szCs w:val="22"/>
+        </w:rPr>
+        <w:t>,</w:t>
+      </w:r>
+      <w:r>
+        <w:rPr>
+          <w:rFonts w:ascii="Calibri" w:hAnsi="Calibri" w:cs="Calibri"/>
+          <w:sz w:val="22"/>
+          <w:szCs w:val="22"/>
+        </w:rPr>
+        <w:t xml:space="preserve"> </w:t>
+      </w:r>
+      <w:r>
+        <w:rPr>
+          <w:rFonts w:ascii="Calibri" w:hAnsi="Calibri" w:cs="Calibri"/>
+          <w:b/>
+          <w:bCs/>
+          <w:sz w:val="22"/>
+          <w:szCs w:val="22"/>
+        </w:rPr>
+        <w:t>and</w:t>
+      </w:r>
+      <w:proofErr w:type="gramEnd"/>
+      <w:r>
+        <w:rPr>
+          <w:rFonts w:ascii="Calibri" w:hAnsi="Calibri" w:cs="Calibri"/>
+          <w:b/>
+          <w:bCs/>
+          <w:sz w:val="22"/>
+          <w:szCs w:val="22"/>
+        </w:rPr>
+        <w:t xml:space="preserve"> indicate/specify the prompts you used to obtain the results and what prompts you used to get the results</w:t>
       </w:r>
       <w:r>
         <w:rPr>
@@ -4922,7 +4996,7 @@
                 <w:szCs w:val="20"/>
               </w:rPr>
             </w:pPr>
-            <w:hyperlink r:id="rId22" w:history="1">
+            <w:hyperlink r:id="rId21" w:history="1">
               <w:r>
                 <w:rPr>
                   <w:rStyle w:val="Hyperlink"/>
@@ -4948,7 +5022,7 @@
                 <w:szCs w:val="20"/>
               </w:rPr>
             </w:pPr>
-            <w:hyperlink r:id="rId23" w:history="1">
+            <w:hyperlink r:id="rId22" w:history="1">
               <w:r>
                 <w:rPr>
                   <w:rStyle w:val="Hyperlink"/>
@@ -4993,7 +5067,7 @@
                 <w:szCs w:val="20"/>
               </w:rPr>
             </w:pPr>
-            <w:hyperlink r:id="rId24" w:history="1">
+            <w:hyperlink r:id="rId23" w:history="1">
               <w:r>
                 <w:rPr>
                   <w:rStyle w:val="Hyperlink"/>
@@ -5001,7 +5075,17 @@
                   <w:sz w:val="20"/>
                   <w:szCs w:val="20"/>
                 </w:rPr>
-                <w:t xml:space="preserve">Chapter 1 of </w:t>
+                <w:t xml:space="preserve">Chapter 1 </w:t>
+              </w:r>
+              <w:proofErr w:type="gramStart"/>
+              <w:r>
+                <w:rPr>
+                  <w:rStyle w:val="Hyperlink"/>
+                  <w:rFonts w:asciiTheme="minorHAnsi" w:eastAsiaTheme="majorEastAsia" w:hAnsiTheme="minorHAnsi" w:cstheme="minorHAnsi"/>
+                  <w:sz w:val="20"/>
+                  <w:szCs w:val="20"/>
+                </w:rPr>
+                <w:t xml:space="preserve">of </w:t>
               </w:r>
               <w:r>
                 <w:rPr>
@@ -5019,7 +5103,17 @@
                   <w:sz w:val="20"/>
                   <w:szCs w:val="20"/>
                 </w:rPr>
-                <w:t>Data Visualization: A practical introduction</w:t>
+                <w:t>Data</w:t>
+              </w:r>
+              <w:proofErr w:type="gramEnd"/>
+              <w:r>
+                <w:rPr>
+                  <w:rStyle w:val="Hyperlink"/>
+                  <w:rFonts w:asciiTheme="minorHAnsi" w:eastAsiaTheme="majorEastAsia" w:hAnsiTheme="minorHAnsi" w:cstheme="minorHAnsi"/>
+                  <w:sz w:val="20"/>
+                  <w:szCs w:val="20"/>
+                </w:rPr>
+                <w:t xml:space="preserve"> Visualization: A practical introduction</w:t>
               </w:r>
             </w:hyperlink>
           </w:p>
@@ -5037,7 +5131,7 @@
                 <w:szCs w:val="20"/>
               </w:rPr>
             </w:pPr>
-            <w:hyperlink r:id="rId25" w:anchor="1" w:history="1">
+            <w:hyperlink r:id="rId24" w:anchor="1" w:history="1">
               <w:r>
                 <w:rPr>
                   <w:rStyle w:val="Hyperlink"/>
@@ -5249,7 +5343,7 @@
                 <w:szCs w:val="20"/>
               </w:rPr>
             </w:pPr>
-            <w:hyperlink r:id="rId26" w:history="1">
+            <w:hyperlink r:id="rId25" w:history="1">
               <w:r>
                 <w:rPr>
                   <w:rStyle w:val="Hyperlink"/>
@@ -5260,7 +5354,7 @@
                 <w:t xml:space="preserve">Chapter </w:t>
               </w:r>
             </w:hyperlink>
-            <w:hyperlink r:id="rId27" w:history="1">
+            <w:hyperlink r:id="rId26" w:history="1">
               <w:r>
                 <w:rPr>
                   <w:rStyle w:val="Hyperlink"/>
@@ -5482,7 +5576,25 @@
                 <w:sz w:val="20"/>
                 <w:szCs w:val="20"/>
               </w:rPr>
-              <w:t xml:space="preserve"> (RateBeer)</w:t>
+              <w:t xml:space="preserve"> (</w:t>
+            </w:r>
+            <w:proofErr w:type="spellStart"/>
+            <w:r>
+              <w:rPr>
+                <w:rFonts w:asciiTheme="minorHAnsi" w:hAnsiTheme="minorHAnsi" w:cstheme="minorHAnsi"/>
+                <w:sz w:val="20"/>
+                <w:szCs w:val="20"/>
+              </w:rPr>
+              <w:t>RateBeer</w:t>
+            </w:r>
+            <w:proofErr w:type="spellEnd"/>
+            <w:r>
+              <w:rPr>
+                <w:rFonts w:asciiTheme="minorHAnsi" w:hAnsiTheme="minorHAnsi" w:cstheme="minorHAnsi"/>
+                <w:sz w:val="20"/>
+                <w:szCs w:val="20"/>
+              </w:rPr>
+              <w:t>)</w:t>
             </w:r>
           </w:p>
         </w:tc>
@@ -5523,7 +5635,7 @@
                 <w:sz w:val="20"/>
               </w:rPr>
             </w:pPr>
-            <w:hyperlink r:id="rId28" w:history="1">
+            <w:hyperlink r:id="rId27" w:history="1">
               <w:r>
                 <w:rPr>
                   <w:rStyle w:val="Hyperlink"/>
@@ -5534,7 +5646,7 @@
                 <w:t xml:space="preserve">Chapter </w:t>
               </w:r>
             </w:hyperlink>
-            <w:hyperlink r:id="rId29" w:history="1">
+            <w:hyperlink r:id="rId28" w:history="1">
               <w:r>
                 <w:rPr>
                   <w:rStyle w:val="Hyperlink"/>
@@ -5832,7 +5944,7 @@
               </w:rPr>
               <w:t xml:space="preserve"> </w:t>
             </w:r>
-            <w:hyperlink r:id="rId30" w:anchor="linear-regression" w:history="1">
+            <w:hyperlink r:id="rId29" w:anchor="linear-regression" w:history="1">
               <w:r>
                 <w:rPr>
                   <w:rStyle w:val="Hyperlink"/>
@@ -5851,7 +5963,7 @@
               </w:rPr>
               <w:t xml:space="preserve"> and </w:t>
             </w:r>
-            <w:hyperlink r:id="rId31" w:anchor="logistic" w:history="1">
+            <w:hyperlink r:id="rId30" w:anchor="logistic" w:history="1">
               <w:r>
                 <w:rPr>
                   <w:rStyle w:val="Hyperlink"/>
@@ -5903,7 +6015,7 @@
                 <w:szCs w:val="20"/>
               </w:rPr>
             </w:pPr>
-            <w:hyperlink r:id="rId32" w:anchor="1" w:history="1">
+            <w:hyperlink r:id="rId31" w:anchor="1" w:history="1">
               <w:r>
                 <w:rPr>
                   <w:rStyle w:val="Hyperlink"/>
@@ -6250,7 +6362,7 @@
               </w:rPr>
               <w:t xml:space="preserve">PCA: Chapters </w:t>
             </w:r>
-            <w:hyperlink r:id="rId33" w:history="1">
+            <w:hyperlink r:id="rId32" w:history="1">
               <w:r>
                 <w:rPr>
                   <w:rStyle w:val="Hyperlink"/>
@@ -6269,7 +6381,7 @@
               </w:rPr>
               <w:t xml:space="preserve"> and </w:t>
             </w:r>
-            <w:hyperlink r:id="rId34" w:history="1">
+            <w:hyperlink r:id="rId33" w:history="1">
               <w:r>
                 <w:rPr>
                   <w:rStyle w:val="Hyperlink"/>
@@ -6311,7 +6423,7 @@
               </w:rPr>
               <w:t xml:space="preserve">Clustering: </w:t>
             </w:r>
-            <w:hyperlink r:id="rId35" w:history="1">
+            <w:hyperlink r:id="rId34" w:history="1">
               <w:r>
                 <w:rPr>
                   <w:rStyle w:val="Hyperlink"/>
@@ -6338,6 +6450,7 @@
                 <w:szCs w:val="20"/>
               </w:rPr>
             </w:pPr>
+            <w:proofErr w:type="spellStart"/>
             <w:r>
               <w:rPr>
                 <w:sz w:val="20"/>
@@ -6359,7 +6472,7 @@
               </w:rPr>
               <w:t>:</w:t>
             </w:r>
-            <w:hyperlink r:id="rId36" w:history="1">
+            <w:hyperlink r:id="rId35" w:history="1">
               <w:r>
                 <w:rPr>
                   <w:rStyle w:val="Hyperlink"/>
@@ -6367,7 +6480,17 @@
                   <w:sz w:val="20"/>
                   <w:szCs w:val="20"/>
                 </w:rPr>
-                <w:t xml:space="preserve">Marketing </w:t>
+                <w:t>Marketing</w:t>
+              </w:r>
+              <w:proofErr w:type="spellEnd"/>
+              <w:r>
+                <w:rPr>
+                  <w:rStyle w:val="Hyperlink"/>
+                  <w:rFonts w:asciiTheme="minorHAnsi" w:hAnsiTheme="minorHAnsi" w:cstheme="minorHAnsi"/>
+                  <w:sz w:val="20"/>
+                  <w:szCs w:val="20"/>
+                </w:rPr>
+                <w:t xml:space="preserve"> </w:t>
               </w:r>
               <w:r>
                 <w:rPr>
@@ -6472,7 +6595,7 @@
               </w:rPr>
               <w:t xml:space="preserve"> </w:t>
             </w:r>
-            <w:hyperlink r:id="rId37" w:history="1">
+            <w:hyperlink r:id="rId36" w:history="1">
               <w:r>
                 <w:rPr>
                   <w:rStyle w:val="Hyperlink"/>
@@ -6568,19 +6691,15 @@
               <w:ind w:left="351" w:hanging="257"/>
               <w:rPr>
                 <w:rFonts w:asciiTheme="minorHAnsi" w:hAnsiTheme="minorHAnsi" w:cstheme="minorHAnsi"/>
-                <w:b/>
-                <w:bCs/>
-                <w:color w:val="C00000"/>
-                <w:sz w:val="20"/>
-                <w:szCs w:val="20"/>
-              </w:rPr>
-            </w:pPr>
-            <w:r>
-              <w:rPr>
-                <w:rFonts w:asciiTheme="minorHAnsi" w:hAnsiTheme="minorHAnsi" w:cstheme="minorHAnsi"/>
-                <w:b/>
-                <w:bCs/>
-                <w:color w:val="C00000"/>
+                <w:color w:val="000000" w:themeColor="text1"/>
+                <w:sz w:val="20"/>
+                <w:szCs w:val="20"/>
+              </w:rPr>
+            </w:pPr>
+            <w:r>
+              <w:rPr>
+                <w:rFonts w:asciiTheme="minorHAnsi" w:hAnsiTheme="minorHAnsi" w:cstheme="minorHAnsi"/>
+                <w:color w:val="000000" w:themeColor="text1"/>
                 <w:sz w:val="20"/>
                 <w:szCs w:val="20"/>
               </w:rPr>
@@ -7293,7 +7412,7 @@
                 <w:szCs w:val="20"/>
               </w:rPr>
             </w:pPr>
-            <w:hyperlink r:id="rId38" w:history="1">
+            <w:hyperlink r:id="rId37" w:history="1">
               <w:r>
                 <w:rPr>
                   <w:rStyle w:val="Hyperlink"/>
@@ -7301,7 +7420,17 @@
                   <w:sz w:val="20"/>
                   <w:szCs w:val="20"/>
                 </w:rPr>
-                <w:t xml:space="preserve">Chapter 8 of </w:t>
+                <w:t xml:space="preserve">Chapter 8 </w:t>
+              </w:r>
+              <w:proofErr w:type="gramStart"/>
+              <w:r>
+                <w:rPr>
+                  <w:rStyle w:val="Hyperlink"/>
+                  <w:rFonts w:asciiTheme="minorHAnsi" w:eastAsia="Times New Roman" w:hAnsiTheme="minorHAnsi" w:cstheme="minorHAnsi"/>
+                  <w:sz w:val="20"/>
+                  <w:szCs w:val="20"/>
+                </w:rPr>
+                <w:t xml:space="preserve">of </w:t>
               </w:r>
               <w:r>
                 <w:rPr>
@@ -7319,7 +7448,17 @@
                   <w:sz w:val="20"/>
                   <w:szCs w:val="20"/>
                 </w:rPr>
-                <w:t>Introduction to R for Data Science</w:t>
+                <w:t>Introduction</w:t>
+              </w:r>
+              <w:proofErr w:type="gramEnd"/>
+              <w:r>
+                <w:rPr>
+                  <w:rStyle w:val="Hyperlink"/>
+                  <w:rFonts w:asciiTheme="minorHAnsi" w:eastAsia="Times New Roman" w:hAnsiTheme="minorHAnsi" w:cstheme="minorHAnsi"/>
+                  <w:sz w:val="20"/>
+                  <w:szCs w:val="20"/>
+                </w:rPr>
+                <w:t xml:space="preserve"> to R for Data Science</w:t>
               </w:r>
             </w:hyperlink>
           </w:p>
@@ -7337,7 +7476,7 @@
                 <w:szCs w:val="20"/>
               </w:rPr>
             </w:pPr>
-            <w:hyperlink r:id="rId39" w:history="1">
+            <w:hyperlink r:id="rId38" w:history="1">
               <w:r>
                 <w:rPr>
                   <w:rStyle w:val="Hyperlink"/>
@@ -7363,7 +7502,7 @@
                 <w:szCs w:val="20"/>
               </w:rPr>
             </w:pPr>
-            <w:hyperlink r:id="rId40" w:history="1">
+            <w:hyperlink r:id="rId39" w:history="1">
               <w:r>
                 <w:rPr>
                   <w:rStyle w:val="Hyperlink"/>
@@ -7414,7 +7553,7 @@
                 <w:szCs w:val="20"/>
               </w:rPr>
             </w:pPr>
-            <w:hyperlink r:id="rId41" w:history="1">
+            <w:hyperlink r:id="rId40" w:history="1">
               <w:r>
                 <w:rPr>
                   <w:rStyle w:val="Hyperlink"/>
@@ -7440,7 +7579,7 @@
                 <w:szCs w:val="20"/>
               </w:rPr>
             </w:pPr>
-            <w:hyperlink r:id="rId42" w:history="1">
+            <w:hyperlink r:id="rId41" w:history="1">
               <w:r>
                 <w:rPr>
                   <w:rStyle w:val="Hyperlink"/>
@@ -7466,7 +7605,7 @@
                 <w:szCs w:val="20"/>
               </w:rPr>
             </w:pPr>
-            <w:hyperlink r:id="rId43" w:history="1">
+            <w:hyperlink r:id="rId42" w:history="1">
               <w:r>
                 <w:rPr>
                   <w:rStyle w:val="Hyperlink"/>
@@ -7507,7 +7646,7 @@
                 <w:szCs w:val="20"/>
               </w:rPr>
             </w:pPr>
-            <w:hyperlink r:id="rId44" w:history="1">
+            <w:hyperlink r:id="rId43" w:history="1">
               <w:r>
                 <w:rPr>
                   <w:rStyle w:val="Hyperlink"/>
@@ -7515,7 +7654,27 @@
                   <w:sz w:val="20"/>
                   <w:szCs w:val="20"/>
                 </w:rPr>
-                <w:t>Fake It Till You Make It: Reputation, Competition, and Yelp Review Fraud</w:t>
+                <w:t xml:space="preserve">Fake It </w:t>
+              </w:r>
+              <w:proofErr w:type="gramStart"/>
+              <w:r>
+                <w:rPr>
+                  <w:rStyle w:val="Hyperlink"/>
+                  <w:rFonts w:ascii="Calibri" w:hAnsi="Calibri" w:cs="Calibri"/>
+                  <w:sz w:val="20"/>
+                  <w:szCs w:val="20"/>
+                </w:rPr>
+                <w:t>Till</w:t>
+              </w:r>
+              <w:proofErr w:type="gramEnd"/>
+              <w:r>
+                <w:rPr>
+                  <w:rStyle w:val="Hyperlink"/>
+                  <w:rFonts w:ascii="Calibri" w:hAnsi="Calibri" w:cs="Calibri"/>
+                  <w:sz w:val="20"/>
+                  <w:szCs w:val="20"/>
+                </w:rPr>
+                <w:t xml:space="preserve"> You Make It: Reputation, Competition, and Yelp Review Fraud</w:t>
               </w:r>
             </w:hyperlink>
           </w:p>
@@ -7533,7 +7692,7 @@
                 <w:szCs w:val="20"/>
               </w:rPr>
             </w:pPr>
-            <w:hyperlink r:id="rId45" w:history="1">
+            <w:hyperlink r:id="rId44" w:history="1">
               <w:r>
                 <w:rPr>
                   <w:rStyle w:val="Hyperlink"/>
@@ -7751,18 +7910,14 @@
               <w:ind w:left="261" w:hanging="180"/>
               <w:rPr>
                 <w:rFonts w:asciiTheme="minorHAnsi" w:hAnsiTheme="minorHAnsi" w:cstheme="minorHAnsi"/>
-                <w:b/>
-                <w:bCs/>
-                <w:sz w:val="20"/>
-                <w:szCs w:val="20"/>
-              </w:rPr>
-            </w:pPr>
-            <w:r>
-              <w:rPr>
-                <w:rFonts w:asciiTheme="minorHAnsi" w:hAnsiTheme="minorHAnsi" w:cstheme="minorHAnsi"/>
-                <w:b/>
-                <w:bCs/>
-                <w:color w:val="C00000"/>
+                <w:sz w:val="20"/>
+                <w:szCs w:val="20"/>
+              </w:rPr>
+            </w:pPr>
+            <w:r>
+              <w:rPr>
+                <w:rFonts w:asciiTheme="minorHAnsi" w:hAnsiTheme="minorHAnsi" w:cstheme="minorHAnsi"/>
+                <w:color w:val="000000" w:themeColor="text1"/>
                 <w:sz w:val="20"/>
                 <w:szCs w:val="20"/>
               </w:rPr>
@@ -7805,7 +7960,7 @@
                 <w:szCs w:val="20"/>
               </w:rPr>
             </w:pPr>
-            <w:hyperlink r:id="rId46" w:history="1">
+            <w:hyperlink r:id="rId45" w:history="1">
               <w:r>
                 <w:rPr>
                   <w:rStyle w:val="Hyperlink"/>
@@ -7831,7 +7986,7 @@
                 <w:szCs w:val="20"/>
               </w:rPr>
             </w:pPr>
-            <w:hyperlink r:id="rId47" w:history="1">
+            <w:hyperlink r:id="rId46" w:history="1">
               <w:r>
                 <w:rPr>
                   <w:rStyle w:val="Hyperlink"/>
@@ -7885,7 +8040,7 @@
                 <w:u w:val="single"/>
               </w:rPr>
             </w:pPr>
-            <w:hyperlink r:id="rId48" w:history="1">
+            <w:hyperlink r:id="rId47" w:history="1">
               <w:r>
                 <w:rPr>
                   <w:rStyle w:val="Hyperlink"/>
@@ -8064,7 +8219,7 @@
                 <w:szCs w:val="20"/>
               </w:rPr>
             </w:pPr>
-            <w:hyperlink r:id="rId49" w:history="1">
+            <w:hyperlink r:id="rId48" w:history="1">
               <w:r>
                 <w:rPr>
                   <w:rStyle w:val="Hyperlink"/>
@@ -8105,7 +8260,7 @@
                 <w:szCs w:val="20"/>
               </w:rPr>
             </w:pPr>
-            <w:hyperlink r:id="rId50" w:history="1">
+            <w:hyperlink r:id="rId49" w:history="1">
               <w:r>
                 <w:rPr>
                   <w:rStyle w:val="Hyperlink"/>
@@ -8224,18 +8379,14 @@
               <w:ind w:left="261" w:hanging="180"/>
               <w:rPr>
                 <w:rFonts w:asciiTheme="minorHAnsi" w:hAnsiTheme="minorHAnsi" w:cstheme="minorHAnsi"/>
-                <w:b/>
-                <w:bCs/>
-                <w:sz w:val="20"/>
-                <w:szCs w:val="20"/>
-              </w:rPr>
-            </w:pPr>
-            <w:r>
-              <w:rPr>
-                <w:rFonts w:asciiTheme="minorHAnsi" w:hAnsiTheme="minorHAnsi" w:cstheme="minorHAnsi"/>
-                <w:b/>
-                <w:bCs/>
-                <w:color w:val="C00000"/>
+                <w:sz w:val="20"/>
+                <w:szCs w:val="20"/>
+              </w:rPr>
+            </w:pPr>
+            <w:r>
+              <w:rPr>
+                <w:rFonts w:asciiTheme="minorHAnsi" w:hAnsiTheme="minorHAnsi" w:cstheme="minorHAnsi"/>
+                <w:color w:val="000000" w:themeColor="text1"/>
                 <w:sz w:val="20"/>
                 <w:szCs w:val="20"/>
               </w:rPr>
@@ -8278,7 +8429,7 @@
                 <w:szCs w:val="20"/>
               </w:rPr>
             </w:pPr>
-            <w:hyperlink r:id="rId51" w:history="1">
+            <w:hyperlink r:id="rId50" w:history="1">
               <w:r>
                 <w:rPr>
                   <w:rStyle w:val="Hyperlink"/>
@@ -8304,7 +8455,7 @@
                 <w:szCs w:val="20"/>
               </w:rPr>
             </w:pPr>
-            <w:hyperlink r:id="rId52" w:history="1">
+            <w:hyperlink r:id="rId51" w:history="1">
               <w:r>
                 <w:rPr>
                   <w:rStyle w:val="Hyperlink"/>
@@ -10389,7 +10540,7 @@
       <w:r>
         <w:t>An important goal of the educational experience at USC Marshall is to be exposed to and discuss diverse, thought-provoking, and sometimes controversial ideas that challenge one’s beliefs. In this course we will support the values articulated in the USC Marshall “Open Expression Statement” (</w:t>
       </w:r>
-      <w:hyperlink r:id="rId53" w:history="1">
+      <w:hyperlink r:id="rId52" w:history="1">
         <w:r>
           <w:rPr>
             <w:rStyle w:val="Hyperlink"/>
@@ -10430,9 +10581,17 @@
     </w:p>
     <w:p>
       <w:r>
-        <w:t xml:space="preserve">USC welcomes students with disabilities into all of the University’s educational programs. </w:t>
-      </w:r>
-      <w:hyperlink r:id="rId54">
+        <w:t xml:space="preserve">USC welcomes students with disabilities into </w:t>
+      </w:r>
+      <w:proofErr w:type="gramStart"/>
+      <w:r>
+        <w:t>all of</w:t>
+      </w:r>
+      <w:proofErr w:type="gramEnd"/>
+      <w:r>
+        <w:t xml:space="preserve"> the University’s educational programs. </w:t>
+      </w:r>
+      <w:hyperlink r:id="rId53">
         <w:r>
           <w:rPr>
             <w:color w:val="0000FF"/>
@@ -10444,7 +10603,7 @@
       <w:r>
         <w:t xml:space="preserve"> (OSAS) is responsible for the determination of appropriate accommodations for students who encounter disability-related barriers. Once a student has completed the OSAS process (registration, initial appointment, and submitted documentation) and accommodations are determined to be reasonable and appropriate, a Letter of Accommodation (LOA) will be available to generate for each course. The LOA must be given to each course instructor by the student and followed up with a discussion. This should be done as early in the semester as possible as accommodations are not retroactive. More information can be found at </w:t>
       </w:r>
-      <w:hyperlink r:id="rId55">
+      <w:hyperlink r:id="rId54">
         <w:r>
           <w:rPr>
             <w:color w:val="0000FF"/>
@@ -10456,7 +10615,7 @@
       <w:r>
         <w:t xml:space="preserve">. You may contact OSAS at (213) 740-0776 or via email at </w:t>
       </w:r>
-      <w:hyperlink r:id="rId56">
+      <w:hyperlink r:id="rId55">
         <w:r>
           <w:rPr>
             <w:color w:val="0000FF"/>
@@ -10498,7 +10657,7 @@
         </w:rPr>
         <w:t xml:space="preserve">To be eligible for certain kinds of financial aid, students are required to maintain Satisfactory Academic Progress (SAP) toward their degree objectives. Visit the </w:t>
       </w:r>
-      <w:hyperlink r:id="rId57">
+      <w:hyperlink r:id="rId56">
         <w:r>
           <w:rPr>
             <w:color w:val="1155CC"/>
@@ -10513,7 +10672,7 @@
         </w:rPr>
         <w:t xml:space="preserve"> for </w:t>
       </w:r>
-      <w:hyperlink r:id="rId58">
+      <w:hyperlink r:id="rId57">
         <w:r>
           <w:rPr>
             <w:color w:val="1155CC"/>
@@ -10528,7 +10687,7 @@
         </w:rPr>
         <w:t xml:space="preserve">- and </w:t>
       </w:r>
-      <w:hyperlink r:id="rId59">
+      <w:hyperlink r:id="rId58">
         <w:r>
           <w:rPr>
             <w:color w:val="1155CC"/>
@@ -10575,7 +10734,7 @@
           <w:i/>
         </w:rPr>
       </w:pPr>
-      <w:hyperlink r:id="rId60">
+      <w:hyperlink r:id="rId59">
         <w:r>
           <w:rPr>
             <w:i/>
@@ -10624,7 +10783,7 @@
       <w:r>
         <w:fldChar w:fldCharType="end"/>
       </w:r>
-      <w:hyperlink r:id="rId61">
+      <w:hyperlink r:id="rId60">
         <w:r>
           <w:rPr>
             <w:i/>
@@ -10679,7 +10838,7 @@
       <w:r>
         <w:fldChar w:fldCharType="end"/>
       </w:r>
-      <w:hyperlink r:id="rId62">
+      <w:hyperlink r:id="rId61">
         <w:r>
           <w:rPr>
             <w:i/>
@@ -10704,7 +10863,15 @@
         </w:rPr>
       </w:pPr>
       <w:r>
-        <w:t>Confidential advocates, prevention educators, and professional counseling teams work to promote a universal culture of consent, and prevent and respond to gender- and power-based harm. Services available to all USC students at no cost.</w:t>
+        <w:t xml:space="preserve">Confidential advocates, prevention educators, and professional counseling teams work to promote a universal culture of </w:t>
+      </w:r>
+      <w:proofErr w:type="gramStart"/>
+      <w:r>
+        <w:t>consent, and</w:t>
+      </w:r>
+      <w:proofErr w:type="gramEnd"/>
+      <w:r>
+        <w:t xml:space="preserve"> prevent and respond to gender- and power-based harm. Services available to all USC students at no cost.</w:t>
       </w:r>
       <w:r>
         <w:fldChar w:fldCharType="begin"/>
@@ -10727,7 +10894,7 @@
           <w:i/>
         </w:rPr>
       </w:pPr>
-      <w:hyperlink r:id="rId63">
+      <w:hyperlink r:id="rId62">
         <w:r>
           <w:rPr>
             <w:i/>
@@ -10746,7 +10913,15 @@
     </w:p>
     <w:p>
       <w:r>
-        <w:t xml:space="preserve">Information about how to get help or help someone affected by harassment, discrimination, retaliation on the basis of a protected characteristic, rights of protected classes, reporting options, and additional resources for students, faculty, staff, visitors, and applicants. </w:t>
+        <w:t xml:space="preserve">Information about how to get help or help someone affected by harassment, discrimination, retaliation </w:t>
+      </w:r>
+      <w:proofErr w:type="gramStart"/>
+      <w:r>
+        <w:t>on the basis of</w:t>
+      </w:r>
+      <w:proofErr w:type="gramEnd"/>
+      <w:r>
+        <w:t xml:space="preserve"> a protected characteristic, rights of protected classes, reporting options, and additional resources for students, faculty, staff, visitors, and applicants. </w:t>
       </w:r>
     </w:p>
     <w:p/>
@@ -10756,7 +10931,7 @@
           <w:i/>
         </w:rPr>
       </w:pPr>
-      <w:hyperlink r:id="rId64">
+      <w:hyperlink r:id="rId63">
         <w:r>
           <w:rPr>
             <w:i/>
@@ -10804,7 +10979,7 @@
           <w:i/>
         </w:rPr>
       </w:pPr>
-      <w:hyperlink r:id="rId65">
+      <w:hyperlink r:id="rId64">
         <w:r>
           <w:rPr>
             <w:i/>
@@ -10839,7 +11014,7 @@
           <w:i/>
         </w:rPr>
       </w:pPr>
-      <w:hyperlink r:id="rId66">
+      <w:hyperlink r:id="rId65">
         <w:r>
           <w:rPr>
             <w:i/>
@@ -10868,7 +11043,7 @@
           <w:i/>
         </w:rPr>
       </w:pPr>
-      <w:hyperlink r:id="rId67">
+      <w:hyperlink r:id="rId66">
         <w:r>
           <w:rPr>
             <w:i/>
@@ -10891,7 +11066,7 @@
           <w:i/>
         </w:rPr>
       </w:pPr>
-      <w:hyperlink r:id="rId68">
+      <w:hyperlink r:id="rId67">
         <w:r>
           <w:rPr>
             <w:i/>
@@ -10910,7 +11085,15 @@
     </w:p>
     <w:p>
       <w:r>
-        <w:t>For 24 hour emergency assistance or to report a crime: UPC: (213) 740-4321, HSC: (323)-442-1000.</w:t>
+        <w:t xml:space="preserve">For </w:t>
+      </w:r>
+      <w:proofErr w:type="gramStart"/>
+      <w:r>
+        <w:t>24 hour</w:t>
+      </w:r>
+      <w:proofErr w:type="gramEnd"/>
+      <w:r>
+        <w:t xml:space="preserve"> emergency assistance or to report a crime: UPC: (213) 740-4321, HSC: (323)-442-1000.</w:t>
       </w:r>
     </w:p>
     <w:p>
@@ -10924,12 +11107,20 @@
         </w:rPr>
       </w:pPr>
       <w:r>
-        <w:t>For 24 hour non-emergency assistance or information: UPC: (213) 740-6000, HSC: 323-442-1200.</w:t>
+        <w:t xml:space="preserve">For </w:t>
+      </w:r>
+      <w:proofErr w:type="gramStart"/>
+      <w:r>
+        <w:t>24 hour</w:t>
+      </w:r>
+      <w:proofErr w:type="gramEnd"/>
+      <w:r>
+        <w:t xml:space="preserve"> non-emergency assistance or information: UPC: (213) 740-6000, HSC: 323-442-1200.</w:t>
       </w:r>
     </w:p>
     <w:p/>
     <w:p>
-      <w:hyperlink r:id="rId69">
+      <w:hyperlink r:id="rId68">
         <w:r>
           <w:rPr>
             <w:i/>
@@ -10961,7 +11152,7 @@
           <w:i/>
         </w:rPr>
       </w:pPr>
-      <w:hyperlink r:id="rId70">
+      <w:hyperlink r:id="rId69">
         <w:r>
           <w:rPr>
             <w:i/>
@@ -10977,7 +11168,7 @@
         </w:rPr>
         <w:t xml:space="preserve"> - (323) 442-2850 or </w:t>
       </w:r>
-      <w:hyperlink r:id="rId71">
+      <w:hyperlink r:id="rId70">
         <w:r>
           <w:rPr>
             <w:color w:val="0000FF"/>
@@ -11165,7 +11356,21 @@
         <w:rPr>
           <w:rFonts w:asciiTheme="minorHAnsi" w:hAnsiTheme="minorHAnsi" w:cstheme="minorHAnsi"/>
         </w:rPr>
-        <w:t xml:space="preserve"> of interest. As a first step, you have to select a project of interest for your</w:t>
+        <w:t xml:space="preserve"> of interest. As a first step, you </w:t>
+      </w:r>
+      <w:proofErr w:type="gramStart"/>
+      <w:r>
+        <w:rPr>
+          <w:rFonts w:asciiTheme="minorHAnsi" w:hAnsiTheme="minorHAnsi" w:cstheme="minorHAnsi"/>
+        </w:rPr>
+        <w:t>have to</w:t>
+      </w:r>
+      <w:proofErr w:type="gramEnd"/>
+      <w:r>
+        <w:rPr>
+          <w:rFonts w:asciiTheme="minorHAnsi" w:hAnsiTheme="minorHAnsi" w:cstheme="minorHAnsi"/>
+        </w:rPr>
+        <w:t xml:space="preserve"> select a project of interest for your</w:t>
       </w:r>
     </w:p>
     <w:p>
@@ -11203,7 +11408,21 @@
         <w:rPr>
           <w:rFonts w:asciiTheme="minorHAnsi" w:hAnsiTheme="minorHAnsi" w:cstheme="minorHAnsi"/>
         </w:rPr>
-        <w:t>is not absolutely necessary. The project should be related to material covered in the course and</w:t>
+        <w:t xml:space="preserve">is not </w:t>
+      </w:r>
+      <w:proofErr w:type="gramStart"/>
+      <w:r>
+        <w:rPr>
+          <w:rFonts w:asciiTheme="minorHAnsi" w:hAnsiTheme="minorHAnsi" w:cstheme="minorHAnsi"/>
+        </w:rPr>
+        <w:t>absolutely necessary</w:t>
+      </w:r>
+      <w:proofErr w:type="gramEnd"/>
+      <w:r>
+        <w:rPr>
+          <w:rFonts w:asciiTheme="minorHAnsi" w:hAnsiTheme="minorHAnsi" w:cstheme="minorHAnsi"/>
+        </w:rPr>
+        <w:t>. The project should be related to material covered in the course and</w:t>
       </w:r>
     </w:p>
     <w:p>
@@ -11789,13 +12008,23 @@
           <w:szCs w:val="22"/>
         </w:rPr>
       </w:pPr>
-      <w:r>
-        <w:rPr>
-          <w:rFonts w:asciiTheme="minorHAnsi" w:hAnsiTheme="minorHAnsi" w:cstheme="minorHAnsi"/>
-          <w:sz w:val="22"/>
-          <w:szCs w:val="22"/>
-        </w:rPr>
-        <w:t>A brief summary of the results</w:t>
+      <w:proofErr w:type="gramStart"/>
+      <w:r>
+        <w:rPr>
+          <w:rFonts w:asciiTheme="minorHAnsi" w:hAnsiTheme="minorHAnsi" w:cstheme="minorHAnsi"/>
+          <w:sz w:val="22"/>
+          <w:szCs w:val="22"/>
+        </w:rPr>
+        <w:t>A brief summary</w:t>
+      </w:r>
+      <w:proofErr w:type="gramEnd"/>
+      <w:r>
+        <w:rPr>
+          <w:rFonts w:asciiTheme="minorHAnsi" w:hAnsiTheme="minorHAnsi" w:cstheme="minorHAnsi"/>
+          <w:sz w:val="22"/>
+          <w:szCs w:val="22"/>
+        </w:rPr>
+        <w:t xml:space="preserve"> of the results</w:t>
       </w:r>
     </w:p>
     <w:p>
@@ -16879,7 +17108,7 @@
       </w:r>
     </w:p>
     <w:sectPr>
-      <w:footerReference w:type="default" r:id="rId72"/>
+      <w:footerReference w:type="default" r:id="rId71"/>
       <w:pgSz w:w="12240" w:h="15840" w:code="1"/>
       <w:pgMar w:top="1008" w:right="1008" w:bottom="1008" w:left="1440" w:header="720" w:footer="432" w:gutter="0"/>
       <w:cols w:space="720"/>

</xml_diff>

<commit_message>
Schedule shift: RateBeer over two sessions (Sept 10, 15), drop Sept 29 guest slot, OLS/Logit/clustering/recs each move one session; case due Sept 20
Co-Authored-By: Claude Fable 5.1 <noreply@anthropic.com>
</commit_message>
<xml_diff>
--- a/syllabus/mkt566-syllabus-proserpio.docx
+++ b/syllabus/mkt566-syllabus-proserpio.docx
@@ -5552,49 +5552,7 @@
                 <w:sz w:val="20"/>
                 <w:szCs w:val="20"/>
               </w:rPr>
-              <w:t>Exploratory data analysis</w:t>
-            </w:r>
-            <w:r>
-              <w:rPr>
-                <w:rFonts w:asciiTheme="minorHAnsi" w:hAnsiTheme="minorHAnsi" w:cstheme="minorHAnsi"/>
-                <w:sz w:val="20"/>
-                <w:szCs w:val="20"/>
-              </w:rPr>
-              <w:t xml:space="preserve">: </w:t>
-            </w:r>
-            <w:r>
-              <w:rPr>
-                <w:rFonts w:asciiTheme="minorHAnsi" w:hAnsiTheme="minorHAnsi" w:cstheme="minorHAnsi"/>
-                <w:sz w:val="20"/>
-                <w:szCs w:val="20"/>
-              </w:rPr>
-              <w:t>In-class exercise</w:t>
-            </w:r>
-            <w:r>
-              <w:rPr>
-                <w:rFonts w:asciiTheme="minorHAnsi" w:hAnsiTheme="minorHAnsi" w:cstheme="minorHAnsi"/>
-                <w:sz w:val="20"/>
-                <w:szCs w:val="20"/>
-              </w:rPr>
-              <w:t xml:space="preserve"> (</w:t>
-            </w:r>
-            <w:proofErr w:type="spellStart"/>
-            <w:r>
-              <w:rPr>
-                <w:rFonts w:asciiTheme="minorHAnsi" w:hAnsiTheme="minorHAnsi" w:cstheme="minorHAnsi"/>
-                <w:sz w:val="20"/>
-                <w:szCs w:val="20"/>
-              </w:rPr>
-              <w:t>RateBeer</w:t>
-            </w:r>
-            <w:proofErr w:type="spellEnd"/>
-            <w:r>
-              <w:rPr>
-                <w:rFonts w:asciiTheme="minorHAnsi" w:hAnsiTheme="minorHAnsi" w:cstheme="minorHAnsi"/>
-                <w:sz w:val="20"/>
-                <w:szCs w:val="20"/>
-              </w:rPr>
-              <w:t>)</w:t>
+              <w:t xml:space="preserve">Exploratory data analysis: In-class exercise (RateBeer), part 1</w:t>
             </w:r>
           </w:p>
         </w:tc>
@@ -5827,15 +5785,7 @@
                 <w:sz w:val="20"/>
                 <w:szCs w:val="20"/>
               </w:rPr>
-              <w:t>Modeling relations between variables</w:t>
-            </w:r>
-            <w:r>
-              <w:rPr>
-                <w:rFonts w:asciiTheme="minorHAnsi" w:hAnsiTheme="minorHAnsi" w:cstheme="minorHAnsi"/>
-                <w:sz w:val="20"/>
-                <w:szCs w:val="20"/>
-              </w:rPr>
-              <w:t>: OLS &amp; Logit</w:t>
+              <w:t xml:space="preserve">Exploratory data analysis: In-class exercise (RateBeer), part 2</w:t>
             </w:r>
           </w:p>
           <w:p>
@@ -5858,23 +5808,7 @@
                 <w:sz w:val="20"/>
                 <w:szCs w:val="20"/>
               </w:rPr>
-              <w:t>Modeling relations between variables</w:t>
-            </w:r>
-            <w:r>
-              <w:rPr>
-                <w:rFonts w:asciiTheme="minorHAnsi" w:hAnsiTheme="minorHAnsi" w:cstheme="minorHAnsi"/>
-                <w:sz w:val="20"/>
-                <w:szCs w:val="20"/>
-              </w:rPr>
-              <w:t>: In class exercise</w:t>
-            </w:r>
-            <w:r>
-              <w:rPr>
-                <w:rFonts w:asciiTheme="minorHAnsi" w:hAnsiTheme="minorHAnsi" w:cstheme="minorHAnsi"/>
-                <w:sz w:val="20"/>
-                <w:szCs w:val="20"/>
-              </w:rPr>
-              <w:t xml:space="preserve"> (Airbnb)</w:t>
+              <w:t xml:space="preserve">Modeling relations between variables: OLS</w:t>
             </w:r>
           </w:p>
         </w:tc>
@@ -6292,7 +6226,7 @@
                 <w:sz w:val="20"/>
                 <w:szCs w:val="20"/>
               </w:rPr>
-              <w:t>Clustering</w:t>
+              <w:t xml:space="preserve">Modeling relations between variables: Logit; in class exercise (Airbnb)</w:t>
             </w:r>
           </w:p>
           <w:p>
@@ -6315,7 +6249,7 @@
                 <w:sz w:val="20"/>
                 <w:szCs w:val="20"/>
               </w:rPr>
-              <w:t>Recommendations/personalization</w:t>
+              <w:t xml:space="preserve">Clustering</w:t>
             </w:r>
           </w:p>
         </w:tc>
@@ -6434,6 +6368,198 @@
                 <w:t>Chapter 7 of R for Marketing Students</w:t>
               </w:r>
             </w:hyperlink>
+          </w:p>
+          <w:p>
+            <w:pPr>
+              <w:rPr>
+                <w:rFonts w:asciiTheme="minorHAnsi" w:hAnsiTheme="minorHAnsi" w:cstheme="minorHAnsi"/>
+                <w:sz w:val="20"/>
+                <w:szCs w:val="20"/>
+              </w:rPr>
+            </w:pPr>
+            <w:r>
+              <w:rPr>
+                <w:rFonts w:asciiTheme="minorHAnsi" w:hAnsiTheme="minorHAnsi" w:cstheme="minorHAnsi"/>
+                <w:sz w:val="20"/>
+                <w:szCs w:val="20"/>
+              </w:rPr>
+              <w:t>Optional:</w:t>
+            </w:r>
+          </w:p>
+          <w:p>
+            <w:pPr>
+              <w:pStyle w:val="ListParagraph"/>
+              <w:numPr>
+                <w:ilvl w:val="0"/>
+                <w:numId w:val="33"/>
+              </w:numPr>
+              <w:ind w:hanging="193"/>
+              <w:rPr>
+                <w:rFonts w:asciiTheme="minorHAnsi" w:hAnsiTheme="minorHAnsi" w:cstheme="minorHAnsi"/>
+                <w:sz w:val="20"/>
+                <w:szCs w:val="20"/>
+              </w:rPr>
+            </w:pPr>
+            <w:r>
+              <w:rPr>
+                <w:rFonts w:asciiTheme="minorHAnsi" w:hAnsiTheme="minorHAnsi" w:cstheme="minorHAnsi"/>
+                <w:sz w:val="20"/>
+                <w:szCs w:val="20"/>
+              </w:rPr>
+              <w:t xml:space="preserve">Clustering: </w:t>
+            </w:r>
+            <w:r>
+              <w:rPr>
+                <w:rFonts w:asciiTheme="minorHAnsi" w:hAnsiTheme="minorHAnsi" w:cstheme="minorHAnsi"/>
+                <w:sz w:val="20"/>
+                <w:szCs w:val="20"/>
+              </w:rPr>
+              <w:t>Chapter 11.1–11.3 of R for Marketing Analytics</w:t>
+            </w:r>
+          </w:p>
+        </w:tc>
+        <w:tc>
+          <w:tcPr>
+            <w:tcW w:w="2836" w:type="dxa"/>
+          </w:tcPr>
+          <w:p>
+            <w:pPr>
+              <w:rPr>
+                <w:rFonts w:asciiTheme="minorHAnsi" w:hAnsiTheme="minorHAnsi" w:cstheme="minorHAnsi"/>
+                <w:color w:val="000000" w:themeColor="text1"/>
+                <w:sz w:val="20"/>
+                <w:szCs w:val="20"/>
+              </w:rPr>
+            </w:pPr>
+          </w:p>
+        </w:tc>
+      </w:tr>
+      <w:tr>
+        <w:trPr>
+          <w:cantSplit/>
+          <w:trHeight w:val="587"/>
+        </w:trPr>
+        <w:tc>
+          <w:tcPr>
+            <w:tcW w:w="1647" w:type="dxa"/>
+          </w:tcPr>
+          <w:p>
+            <w:pPr>
+              <w:pStyle w:val="Heading4"/>
+              <w:rPr>
+                <w:rFonts w:asciiTheme="minorHAnsi" w:hAnsiTheme="minorHAnsi" w:cstheme="minorHAnsi"/>
+                <w:i w:val="0"/>
+                <w:iCs/>
+                <w:color w:val="000000" w:themeColor="text1"/>
+                <w:sz w:val="20"/>
+                <w:szCs w:val="20"/>
+              </w:rPr>
+            </w:pPr>
+            <w:r>
+              <w:rPr>
+                <w:rFonts w:asciiTheme="minorHAnsi" w:hAnsiTheme="minorHAnsi" w:cstheme="minorHAnsi"/>
+                <w:i w:val="0"/>
+                <w:iCs/>
+                <w:color w:val="000000" w:themeColor="text1"/>
+                <w:sz w:val="20"/>
+                <w:szCs w:val="20"/>
+              </w:rPr>
+              <w:t>Week 6</w:t>
+            </w:r>
+          </w:p>
+          <w:p>
+            <w:pPr>
+              <w:rPr>
+                <w:rFonts w:asciiTheme="minorHAnsi" w:hAnsiTheme="minorHAnsi" w:cstheme="minorHAnsi"/>
+                <w:color w:val="000000" w:themeColor="text1"/>
+                <w:sz w:val="20"/>
+                <w:szCs w:val="20"/>
+              </w:rPr>
+            </w:pPr>
+            <w:r>
+              <w:rPr>
+                <w:rFonts w:asciiTheme="minorHAnsi" w:hAnsiTheme="minorHAnsi" w:cstheme="minorHAnsi"/>
+                <w:color w:val="000000" w:themeColor="text1"/>
+                <w:sz w:val="20"/>
+                <w:szCs w:val="20"/>
+              </w:rPr>
+              <w:t>Sept 29, Oct 1</w:t>
+            </w:r>
+          </w:p>
+        </w:tc>
+        <w:tc>
+          <w:tcPr>
+            <w:tcW w:w="2758" w:type="dxa"/>
+          </w:tcPr>
+          <w:p>
+            <w:pPr>
+              <w:pStyle w:val="ListParagraph"/>
+              <w:numPr>
+                <w:ilvl w:val="0"/>
+                <w:numId w:val="33"/>
+              </w:numPr>
+              <w:ind w:left="351" w:hanging="257"/>
+              <w:rPr>
+                <w:rFonts w:asciiTheme="minorHAnsi" w:hAnsiTheme="minorHAnsi" w:cstheme="minorHAnsi"/>
+                <w:color w:val="000000" w:themeColor="text1"/>
+                <w:sz w:val="20"/>
+                <w:szCs w:val="20"/>
+              </w:rPr>
+            </w:pPr>
+            <w:r>
+              <w:rPr>
+                <w:rFonts w:asciiTheme="minorHAnsi" w:hAnsiTheme="minorHAnsi" w:cstheme="minorHAnsi"/>
+                <w:color w:val="000000" w:themeColor="text1"/>
+                <w:sz w:val="20"/>
+                <w:szCs w:val="20"/>
+              </w:rPr>
+              <w:t xml:space="preserve">Recommendations/personalization</w:t>
+            </w:r>
+          </w:p>
+          <w:p>
+            <w:pPr>
+              <w:pStyle w:val="ListParagraph"/>
+              <w:numPr>
+                <w:ilvl w:val="0"/>
+                <w:numId w:val="33"/>
+              </w:numPr>
+              <w:ind w:left="351" w:hanging="257"/>
+              <w:rPr>
+                <w:rFonts w:asciiTheme="minorHAnsi" w:hAnsiTheme="minorHAnsi" w:cstheme="minorHAnsi"/>
+                <w:sz w:val="20"/>
+                <w:szCs w:val="20"/>
+              </w:rPr>
+            </w:pPr>
+            <w:r>
+              <w:rPr>
+                <w:rFonts w:asciiTheme="minorHAnsi" w:hAnsiTheme="minorHAnsi" w:cstheme="minorHAnsi"/>
+                <w:sz w:val="20"/>
+                <w:szCs w:val="20"/>
+              </w:rPr>
+              <w:t>Clustering/recs.: in class exercise</w:t>
+            </w:r>
+          </w:p>
+        </w:tc>
+        <w:tc>
+          <w:tcPr>
+            <w:tcW w:w="2876" w:type="dxa"/>
+          </w:tcPr>
+          <w:p>
+            <w:pPr>
+              <w:rPr>
+                <w:rFonts w:asciiTheme="minorHAnsi" w:hAnsiTheme="minorHAnsi" w:cstheme="minorHAnsi"/>
+                <w:sz w:val="20"/>
+                <w:szCs w:val="20"/>
+              </w:rPr>
+            </w:pPr>
+            <w:r>
+              <w:rPr>
+                <w:rFonts w:asciiTheme="minorHAnsi" w:hAnsiTheme="minorHAnsi" w:cstheme="minorHAnsi"/>
+                <w:sz w:val="20"/>
+                <w:szCs w:val="20"/>
+              </w:rPr>
+              <w:t>Required:</w:t>
+            </w:r>
           </w:p>
           <w:p>
             <w:pPr>
@@ -6523,37 +6649,6 @@
           </w:p>
           <w:p>
             <w:pPr>
-              <w:pStyle w:val="ListParagraph"/>
-              <w:numPr>
-                <w:ilvl w:val="0"/>
-                <w:numId w:val="33"/>
-              </w:numPr>
-              <w:ind w:hanging="193"/>
-              <w:rPr>
-                <w:rFonts w:asciiTheme="minorHAnsi" w:hAnsiTheme="minorHAnsi" w:cstheme="minorHAnsi"/>
-                <w:sz w:val="20"/>
-                <w:szCs w:val="20"/>
-              </w:rPr>
-            </w:pPr>
-            <w:r>
-              <w:rPr>
-                <w:rFonts w:asciiTheme="minorHAnsi" w:hAnsiTheme="minorHAnsi" w:cstheme="minorHAnsi"/>
-                <w:sz w:val="20"/>
-                <w:szCs w:val="20"/>
-              </w:rPr>
-              <w:t xml:space="preserve">Clustering: </w:t>
-            </w:r>
-            <w:r>
-              <w:rPr>
-                <w:rFonts w:asciiTheme="minorHAnsi" w:hAnsiTheme="minorHAnsi" w:cstheme="minorHAnsi"/>
-                <w:sz w:val="20"/>
-                <w:szCs w:val="20"/>
-              </w:rPr>
-              <w:t>Chapter 11.1–11.3 of R for Marketing Analytics</w:t>
-            </w:r>
-          </w:p>
-          <w:p>
-            <w:pPr>
               <w:widowControl w:val="0"/>
               <w:numPr>
                 <w:ilvl w:val="0"/>
@@ -6606,142 +6701,6 @@
                 <w:t>Two Decades of Recommender Systems at Amazon.com</w:t>
               </w:r>
             </w:hyperlink>
-          </w:p>
-        </w:tc>
-        <w:tc>
-          <w:tcPr>
-            <w:tcW w:w="2836" w:type="dxa"/>
-          </w:tcPr>
-          <w:p>
-            <w:pPr>
-              <w:rPr>
-                <w:rFonts w:asciiTheme="minorHAnsi" w:hAnsiTheme="minorHAnsi" w:cstheme="minorHAnsi"/>
-                <w:color w:val="000000" w:themeColor="text1"/>
-                <w:sz w:val="20"/>
-                <w:szCs w:val="20"/>
-              </w:rPr>
-            </w:pPr>
-          </w:p>
-        </w:tc>
-      </w:tr>
-      <w:tr>
-        <w:trPr>
-          <w:cantSplit/>
-          <w:trHeight w:val="587"/>
-        </w:trPr>
-        <w:tc>
-          <w:tcPr>
-            <w:tcW w:w="1647" w:type="dxa"/>
-          </w:tcPr>
-          <w:p>
-            <w:pPr>
-              <w:pStyle w:val="Heading4"/>
-              <w:rPr>
-                <w:rFonts w:asciiTheme="minorHAnsi" w:hAnsiTheme="minorHAnsi" w:cstheme="minorHAnsi"/>
-                <w:i w:val="0"/>
-                <w:iCs/>
-                <w:color w:val="000000" w:themeColor="text1"/>
-                <w:sz w:val="20"/>
-                <w:szCs w:val="20"/>
-              </w:rPr>
-            </w:pPr>
-            <w:r>
-              <w:rPr>
-                <w:rFonts w:asciiTheme="minorHAnsi" w:hAnsiTheme="minorHAnsi" w:cstheme="minorHAnsi"/>
-                <w:i w:val="0"/>
-                <w:iCs/>
-                <w:color w:val="000000" w:themeColor="text1"/>
-                <w:sz w:val="20"/>
-                <w:szCs w:val="20"/>
-              </w:rPr>
-              <w:t>Week 6</w:t>
-            </w:r>
-          </w:p>
-          <w:p>
-            <w:pPr>
-              <w:rPr>
-                <w:rFonts w:asciiTheme="minorHAnsi" w:hAnsiTheme="minorHAnsi" w:cstheme="minorHAnsi"/>
-                <w:color w:val="000000" w:themeColor="text1"/>
-                <w:sz w:val="20"/>
-                <w:szCs w:val="20"/>
-              </w:rPr>
-            </w:pPr>
-            <w:r>
-              <w:rPr>
-                <w:rFonts w:asciiTheme="minorHAnsi" w:hAnsiTheme="minorHAnsi" w:cstheme="minorHAnsi"/>
-                <w:color w:val="000000" w:themeColor="text1"/>
-                <w:sz w:val="20"/>
-                <w:szCs w:val="20"/>
-              </w:rPr>
-              <w:t>Sept 29, Oct 1</w:t>
-            </w:r>
-          </w:p>
-        </w:tc>
-        <w:tc>
-          <w:tcPr>
-            <w:tcW w:w="2758" w:type="dxa"/>
-          </w:tcPr>
-          <w:p>
-            <w:pPr>
-              <w:pStyle w:val="ListParagraph"/>
-              <w:numPr>
-                <w:ilvl w:val="0"/>
-                <w:numId w:val="33"/>
-              </w:numPr>
-              <w:ind w:left="351" w:hanging="257"/>
-              <w:rPr>
-                <w:rFonts w:asciiTheme="minorHAnsi" w:hAnsiTheme="minorHAnsi" w:cstheme="minorHAnsi"/>
-                <w:color w:val="000000" w:themeColor="text1"/>
-                <w:sz w:val="20"/>
-                <w:szCs w:val="20"/>
-              </w:rPr>
-            </w:pPr>
-            <w:r>
-              <w:rPr>
-                <w:rFonts w:asciiTheme="minorHAnsi" w:hAnsiTheme="minorHAnsi" w:cstheme="minorHAnsi"/>
-                <w:color w:val="000000" w:themeColor="text1"/>
-                <w:sz w:val="20"/>
-                <w:szCs w:val="20"/>
-              </w:rPr>
-              <w:t>Guest speaker</w:t>
-            </w:r>
-          </w:p>
-          <w:p>
-            <w:pPr>
-              <w:pStyle w:val="ListParagraph"/>
-              <w:numPr>
-                <w:ilvl w:val="0"/>
-                <w:numId w:val="33"/>
-              </w:numPr>
-              <w:ind w:left="351" w:hanging="257"/>
-              <w:rPr>
-                <w:rFonts w:asciiTheme="minorHAnsi" w:hAnsiTheme="minorHAnsi" w:cstheme="minorHAnsi"/>
-                <w:sz w:val="20"/>
-                <w:szCs w:val="20"/>
-              </w:rPr>
-            </w:pPr>
-            <w:r>
-              <w:rPr>
-                <w:rFonts w:asciiTheme="minorHAnsi" w:hAnsiTheme="minorHAnsi" w:cstheme="minorHAnsi"/>
-                <w:sz w:val="20"/>
-                <w:szCs w:val="20"/>
-              </w:rPr>
-              <w:t>Clustering/recs.: in class exercise</w:t>
-            </w:r>
-          </w:p>
-        </w:tc>
-        <w:tc>
-          <w:tcPr>
-            <w:tcW w:w="2876" w:type="dxa"/>
-          </w:tcPr>
-          <w:p>
-            <w:pPr>
-              <w:rPr>
-                <w:rFonts w:asciiTheme="minorHAnsi" w:hAnsiTheme="minorHAnsi" w:cstheme="minorHAnsi"/>
-                <w:sz w:val="20"/>
-                <w:szCs w:val="20"/>
-              </w:rPr>
-            </w:pPr>
           </w:p>
         </w:tc>
         <w:tc>

</xml_diff>

<commit_message>
Syllabus: name Nov 5 guest speaker (Andrea Ciufo, dentsu) and Nov 17 (Giovanni Marano, FanDuel)
Co-Authored-By: Claude Fable 5.1 <noreply@anthropic.com>
</commit_message>
<xml_diff>
--- a/syllabus/mkt566-syllabus-proserpio.docx
+++ b/syllabus/mkt566-syllabus-proserpio.docx
@@ -7880,7 +7880,27 @@
                 <w:sz w:val="20"/>
                 <w:szCs w:val="20"/>
               </w:rPr>
-              <w:t>Guest speaker</w:t>
+              <w:t xml:space="preserve">Guest speaker: </w:t>
+            </w:r>
+            <w:hyperlink r:id="rId74" w:history="1">
+              <w:r>
+                <w:rPr>
+                  <w:rStyle w:val="Hyperlink"/>
+                  <w:rFonts w:asciiTheme="minorHAnsi" w:hAnsiTheme="minorHAnsi" w:cstheme="minorHAnsi"/>
+                  <w:sz w:val="20"/>
+                  <w:szCs w:val="20"/>
+                </w:rPr>
+                <w:t>Andrea Ciufo</w:t>
+              </w:r>
+            </w:hyperlink>
+            <w:r>
+              <w:rPr>
+                <w:rFonts w:asciiTheme="minorHAnsi" w:hAnsiTheme="minorHAnsi" w:cstheme="minorHAnsi"/>
+                <w:color w:val="000000" w:themeColor="text1"/>
+                <w:sz w:val="20"/>
+                <w:szCs w:val="20"/>
+              </w:rPr>
+              <w:t xml:space="preserve"> (dentsu)</w:t>
             </w:r>
           </w:p>
         </w:tc>
@@ -8349,7 +8369,27 @@
                 <w:sz w:val="20"/>
                 <w:szCs w:val="20"/>
               </w:rPr>
-              <w:t>Guest speaker</w:t>
+              <w:t xml:space="preserve">Guest speaker: </w:t>
+            </w:r>
+            <w:hyperlink r:id="rId75" w:history="1">
+              <w:r>
+                <w:rPr>
+                  <w:rStyle w:val="Hyperlink"/>
+                  <w:rFonts w:asciiTheme="minorHAnsi" w:hAnsiTheme="minorHAnsi" w:cstheme="minorHAnsi"/>
+                  <w:sz w:val="20"/>
+                  <w:szCs w:val="20"/>
+                </w:rPr>
+                <w:t>Giovanni Marano</w:t>
+              </w:r>
+            </w:hyperlink>
+            <w:r>
+              <w:rPr>
+                <w:rFonts w:asciiTheme="minorHAnsi" w:hAnsiTheme="minorHAnsi" w:cstheme="minorHAnsi"/>
+                <w:color w:val="000000" w:themeColor="text1"/>
+                <w:sz w:val="20"/>
+                <w:szCs w:val="20"/>
+              </w:rPr>
+              <w:t xml:space="preserve"> (FanDuel)</w:t>
             </w:r>
           </w:p>
         </w:tc>

</xml_diff>